<commit_message>
Sign-off packet regenerated: source names resolved across modules
Co-Authored-By: Claude Opus 5.5 <noreply@anthropic.com>
</commit_message>
<xml_diff>
--- a/course-production/hormones-peptides-skin/review/signoff-items.docx
+++ b/course-production/hormones-peptides-skin/review/signoff-items.docx
@@ -839,7 +839,7 @@
         <w:t xml:space="preserve"> </w:t>
       </w:r>
       <w:r>
-        <w:t xml:space="preserve">(eu-hma-core-smpc-hrt-2025 · eu-reg-1223-2009 · eu-ec-cosmetics-borderline-manual-2025)</w:t>
+        <w:t xml:space="preserve">(Co-ordination Group for Mutual Recognition and Decentralised Procedures – Human (CMDh) 2025 · European Parliament and Council of the European Union 2009 · Working Group on Cosmetic Products (European Commission and member states) 2025)</w:t>
       </w:r>
       <w:r>
         <w:t xml:space="preserve"> </w:t>
@@ -867,7 +867,7 @@
         <w:t xml:space="preserve"> </w:t>
       </w:r>
       <w:r>
-        <w:t xml:space="preserve">(pt-rcm-estreva · pt-rcm-estrofem · pt-infomed · pt-rcm-ketrel)</w:t>
+        <w:t xml:space="preserve">(Theramex / INFARMED 2026 · INFARMED 2024 · INFARMED 2026 · Laboratoires Bailleul / INFARMED 2024)</w:t>
       </w:r>
       <w:r>
         <w:t xml:space="preserve"> </w:t>
@@ -895,7 +895,7 @@
         <w:t xml:space="preserve"> </w:t>
       </w:r>
       <w:r>
-        <w:t xml:space="preserve">(br-label-oestrogel · br-anvisa-register-opendata · br-label-vitacid · br-cfm-1999-2012 · br-cfm-norms-search · br-cfm-2333-2023)</w:t>
+        <w:t xml:space="preserve">(Besins Healthcare Brasil (Anvisa-approved package leaflet) 2025 · Agência Nacional de Vigilância Sanitária (Anvisa) 2026 · Theraskin Farmacêutica Ltda (Anvisa-approved package leaflet) 2025 · Conselho Federal de Medicina 2012 · Conselho Federal de Medicina 2026 · Conselho Federal de Medicina 2023)</w:t>
       </w:r>
       <w:r>
         <w:t xml:space="preserve"> </w:t>
@@ -923,7 +923,7 @@
         <w:t xml:space="preserve"> </w:t>
       </w:r>
       <w:r>
-        <w:t xml:space="preserve">(ae-fdl-28-2023 · ae-ede-reg-oestrogel · ae-ede-register · ae-fdl-38-2024)</w:t>
+        <w:t xml:space="preserve">(UAE federal legislation (President of the UAE) 2023 · Emirates Drug Establishment (EDE) 2026 · Emirates Drug Establishment (EDE) 2026 · UAE federal legislation (President of the UAE) 2024)</w:t>
       </w:r>
     </w:p>
     <w:p>
@@ -1213,7 +1213,7 @@
         <w:t xml:space="preserve"> </w:t>
       </w:r>
       <w:r>
-        <w:t xml:space="preserve">(eu-hma-core-smpc-hrt-2025 · eu-reg-1223-2009 · eu-ec-cosmetics-borderline-manual-2025)</w:t>
+        <w:t xml:space="preserve">(Co-ordination Group for Mutual Recognition and Decentralised Procedures – Human (CMDh) 2025 · European Parliament and Council of the European Union 2009 · Working Group on Cosmetic Products (European Commission and member states) 2025)</w:t>
       </w:r>
       <w:r>
         <w:t xml:space="preserve"> </w:t>
@@ -1241,7 +1241,7 @@
         <w:t xml:space="preserve"> </w:t>
       </w:r>
       <w:r>
-        <w:t xml:space="preserve">(pt-rcm-estreva · pt-rcm-estrofem · pt-infomed · pt-rcm-ketrel)</w:t>
+        <w:t xml:space="preserve">(Theramex / INFARMED 2026 · INFARMED 2024 · INFARMED 2026 · Laboratoires Bailleul / INFARMED 2024)</w:t>
       </w:r>
       <w:r>
         <w:t xml:space="preserve"> </w:t>
@@ -1269,7 +1269,7 @@
         <w:t xml:space="preserve"> </w:t>
       </w:r>
       <w:r>
-        <w:t xml:space="preserve">(br-label-oestrogel · br-anvisa-register-opendata · br-label-vitacid · br-cfm-1999-2012 · br-cfm-norms-search · br-cfm-2333-2023)</w:t>
+        <w:t xml:space="preserve">(Besins Healthcare Brasil (Anvisa-approved package leaflet) 2025 · Agência Nacional de Vigilância Sanitária (Anvisa) 2026 · Theraskin Farmacêutica Ltda (Anvisa-approved package leaflet) 2025 · Conselho Federal de Medicina 2012 · Conselho Federal de Medicina 2026 · Conselho Federal de Medicina 2023)</w:t>
       </w:r>
       <w:r>
         <w:t xml:space="preserve"> </w:t>
@@ -1297,7 +1297,7 @@
         <w:t xml:space="preserve"> </w:t>
       </w:r>
       <w:r>
-        <w:t xml:space="preserve">(ae-fdl-28-2023 · ae-ede-reg-oestrogel · ae-ede-register · ae-fdl-38-2024)</w:t>
+        <w:t xml:space="preserve">(UAE federal legislation (President of the UAE) 2023 · Emirates Drug Establishment (EDE) 2026 · Emirates Drug Establishment (EDE) 2026 · UAE federal legislation (President of the UAE) 2024)</w:t>
       </w:r>
     </w:p>
     <w:p>
@@ -1551,7 +1551,7 @@
         <w:t xml:space="preserve"> </w:t>
       </w:r>
       <w:r>
-        <w:t xml:space="preserve">(eu-hma-core-smpc-hrt-2025 · eu-reg-1223-2009 · eu-ec-cosmetics-borderline-manual-2025)</w:t>
+        <w:t xml:space="preserve">(Co-ordination Group for Mutual Recognition and Decentralised Procedures – Human (CMDh) 2025 · European Parliament and Council of the European Union 2009 · Working Group on Cosmetic Products (European Commission and member states) 2025)</w:t>
       </w:r>
       <w:r>
         <w:t xml:space="preserve"> </w:t>
@@ -1579,7 +1579,7 @@
         <w:t xml:space="preserve"> </w:t>
       </w:r>
       <w:r>
-        <w:t xml:space="preserve">(pt-rcm-estreva · pt-rcm-estrofem · pt-infomed · pt-rcm-ketrel)</w:t>
+        <w:t xml:space="preserve">(Theramex / INFARMED 2026 · INFARMED 2024 · INFARMED 2026 · Laboratoires Bailleul / INFARMED 2024)</w:t>
       </w:r>
       <w:r>
         <w:t xml:space="preserve"> </w:t>
@@ -1607,7 +1607,7 @@
         <w:t xml:space="preserve"> </w:t>
       </w:r>
       <w:r>
-        <w:t xml:space="preserve">(br-label-oestrogel · br-anvisa-register-opendata · br-label-vitacid · br-cfm-1999-2012 · br-cfm-norms-search · br-cfm-2333-2023)</w:t>
+        <w:t xml:space="preserve">(Besins Healthcare Brasil (Anvisa-approved package leaflet) 2025 · Agência Nacional de Vigilância Sanitária (Anvisa) 2026 · Theraskin Farmacêutica Ltda (Anvisa-approved package leaflet) 2025 · Conselho Federal de Medicina 2012 · Conselho Federal de Medicina 2026 · Conselho Federal de Medicina 2023)</w:t>
       </w:r>
       <w:r>
         <w:t xml:space="preserve"> </w:t>
@@ -1635,7 +1635,7 @@
         <w:t xml:space="preserve"> </w:t>
       </w:r>
       <w:r>
-        <w:t xml:space="preserve">(ae-fdl-28-2023 · ae-ede-reg-oestrogel · ae-ede-register · ae-fdl-38-2024)</w:t>
+        <w:t xml:space="preserve">(UAE federal legislation (President of the UAE) 2023 · Emirates Drug Establishment (EDE) 2026 · Emirates Drug Establishment (EDE) 2026 · UAE federal legislation (President of the UAE) 2024)</w:t>
       </w:r>
     </w:p>
     <w:p>
@@ -1821,7 +1821,7 @@
         <w:t xml:space="preserve"> </w:t>
       </w:r>
       <w:r>
-        <w:t xml:space="preserve">(eu-ema-glp1-shortages-2024 · eu-ema-epar-mounjaro · eu-union-register · eu-ema-medicines-data)</w:t>
+        <w:t xml:space="preserve">(European Medicines Agency and Heads of Medicines Agencies (MSSG) 2024 · European Medicines Agency 2022 · European Commission 2026 · European Medicines Agency 2026)</w:t>
       </w:r>
       <w:r>
         <w:t xml:space="preserve"> </w:t>
@@ -1849,7 +1849,7 @@
         <w:t xml:space="preserve"> </w:t>
       </w:r>
       <w:r>
-        <w:t xml:space="preserve">(br-label-ozempic · br-anvisa-register-opendata · br-label-wegovy · br-anvisa-semaglutide-synthetic-2026 · br-anvisa-semaglutide-five-2026 · br-anvisa-consultas-medicamentos · br-label-mounjaro · br-anvisa-glp1-qa-2025 · br-anvisa-glp1-retention-2025)</w:t>
+        <w:t xml:space="preserve">(Novo Nordisk Farmacêutica do Brasil Ltda (Anvisa-approved package leaflet) 2026 · Agência Nacional de Vigilância Sanitária (Anvisa) 2026 · Novo Nordisk Farmacêutica do Brasil Ltda (Anvisa-approved package leaflet) 2026 · Agência Nacional de Vigilância Sanitária (Anvisa) 2026 · Agência Nacional de Vigilância Sanitária (Anvisa) 2026 · Agência Nacional de Vigilância Sanitária (Anvisa) 2026 · Eli Lilly do Brasil Ltda (Anvisa-approved package leaflet) 2026 · Anvisa – DIRE5/GGMON/GPCON 2025 · Agência Nacional de Vigilância Sanitária (Anvisa) 2025)</w:t>
       </w:r>
       <w:r>
         <w:t xml:space="preserve"> </w:t>
@@ -1877,7 +1877,7 @@
         <w:t xml:space="preserve"> </w:t>
       </w:r>
       <w:r>
-        <w:t xml:space="preserve">(ae-fdl-28-2023 · ae-ede-reg-wegovy · ae-ede-register · ae-ede-reg-mounjaro)</w:t>
+        <w:t xml:space="preserve">(UAE federal legislation (President of the UAE) 2023 · Emirates Drug Establishment (EDE) 2026 · Emirates Drug Establishment (EDE) 2026 · Emirates Drug Establishment (EDE) 2026)</w:t>
       </w:r>
     </w:p>
     <w:p>
@@ -2223,7 +2223,7 @@
         <w:t xml:space="preserve"> </w:t>
       </w:r>
       <w:r>
-        <w:t xml:space="preserve">(eu-ema-glp1-shortages-2024 · eu-ema-epar-ozempic · eu-ema-epar-wegovy · eu-ema-epar-mounjaro · eu-union-register · eu-ema-medicines-data · eu-ema-illegal-glp1-2025)</w:t>
+        <w:t xml:space="preserve">(European Medicines Agency and Heads of Medicines Agencies (MSSG) 2024 · European Medicines Agency 2018 · European Medicines Agency 2022 · European Medicines Agency 2022 · European Commission 2026 · European Medicines Agency 2026 · European Medicines Agency and Heads of Medicines Agencies 2025)</w:t>
       </w:r>
       <w:r>
         <w:t xml:space="preserve"> </w:t>
@@ -2251,7 +2251,7 @@
         <w:t xml:space="preserve"> </w:t>
       </w:r>
       <w:r>
-        <w:t xml:space="preserve">(pt-infomed · pt-infomed-guide · pt-infarmed-circ045-2024 · pt-infarmed-glp1-illegal-2025)</w:t>
+        <w:t xml:space="preserve">(INFARMED 2026 · INFARMED 2026 · INFARMED 2024 · INFARMED 2025)</w:t>
       </w:r>
       <w:r>
         <w:t xml:space="preserve"> </w:t>
@@ -2279,7 +2279,7 @@
         <w:t xml:space="preserve"> </w:t>
       </w:r>
       <w:r>
-        <w:t xml:space="preserve">(br-label-ozempic · br-anvisa-register-opendata · br-label-wegovy · br-label-mounjaro · br-anvisa-consultas-medicamentos · br-anvisa-semaglutide-synthetic-2026 · br-anvisa-semaglutide-five-2026 · br-anvisa-glp1-compounding-2025 · br-anvisa-nt200-2025 · br-anvisa-pf-2026 · br-anvisa-glp1-actionplan-2026)</w:t>
+        <w:t xml:space="preserve">(Novo Nordisk Farmacêutica do Brasil Ltda (Anvisa-approved package leaflet) 2026 · Agência Nacional de Vigilância Sanitária (Anvisa) 2026 · Novo Nordisk Farmacêutica do Brasil Ltda (Anvisa-approved package leaflet) 2026 · Eli Lilly do Brasil Ltda (Anvisa-approved package leaflet) 2026 · Agência Nacional de Vigilância Sanitária (Anvisa) 2026 · Agência Nacional de Vigilância Sanitária (Anvisa) 2026 · Agência Nacional de Vigilância Sanitária (Anvisa) 2026 · Agência Nacional de Vigilância Sanitária (Anvisa) 2025 · Anvisa – GIMED/GGFIS 2025 · Agência Nacional de Vigilância Sanitária (Anvisa) 2026 · Agência Nacional de Vigilância Sanitária (Anvisa) 2026)</w:t>
       </w:r>
       <w:r>
         <w:t xml:space="preserve"> </w:t>
@@ -2307,7 +2307,7 @@
         <w:t xml:space="preserve"> </w:t>
       </w:r>
       <w:r>
-        <w:t xml:space="preserve">(ae-ede-news-oral-wegovy · ae-mohap-cir-9217-2024 · ae-fdl-38-2024 · ae-ede-cir-31-2026)</w:t>
+        <w:t xml:space="preserve">(Emirates Drug Establishment (EDE) 2026 · Ministry of Health and Prevention (MOHAP) 2024 · UAE federal legislation (President of the UAE) 2024 · Emirates Drug Establishment (EDE) 2026)</w:t>
       </w:r>
     </w:p>
     <w:p>
@@ -3121,7 +3121,7 @@
         <w:t xml:space="preserve"> </w:t>
       </w:r>
       <w:r>
-        <w:t xml:space="preserve">(eu-ema-epar-mounjaro · eu-union-register · eu-ema-medicines-data)</w:t>
+        <w:t xml:space="preserve">(European Medicines Agency 2022 · European Commission 2026 · European Medicines Agency 2026)</w:t>
       </w:r>
       <w:r>
         <w:t xml:space="preserve"> </w:t>
@@ -3149,7 +3149,7 @@
         <w:t xml:space="preserve"> </w:t>
       </w:r>
       <w:r>
-        <w:t xml:space="preserve">(br-label-mounjaro · br-anvisa-consultas-medicamentos · br-anvisa-peptides-2026)</w:t>
+        <w:t xml:space="preserve">(Eli Lilly do Brasil Ltda (Anvisa-approved package leaflet) 2026 · Agência Nacional de Vigilância Sanitária (Anvisa) 2026 · Agência Nacional de Vigilância Sanitária (Anvisa) 2026)</w:t>
       </w:r>
       <w:r>
         <w:t xml:space="preserve"> </w:t>
@@ -3177,7 +3177,7 @@
         <w:t xml:space="preserve"> </w:t>
       </w:r>
       <w:r>
-        <w:t xml:space="preserve">(ae-ede-register · ae-mohap-cir-9217-2024 · ae-dha-cir-peptides-2026 · ae-doh-compounding-std-2026)</w:t>
+        <w:t xml:space="preserve">(Emirates Drug Establishment (EDE) 2026 · Ministry of Health and Prevention (MOHAP) 2024 · Dubai Health Authority (DHA) 2026 · Department of Health – Abu Dhabi (DoH) 2026)</w:t>
       </w:r>
     </w:p>
     <w:p>
@@ -3415,7 +3415,7 @@
         <w:t xml:space="preserve"> </w:t>
       </w:r>
       <w:r>
-        <w:t xml:space="preserve">(eu-dir-2001-83)</w:t>
+        <w:t xml:space="preserve">(European Parliament and Council of the European Union 2001)</w:t>
       </w:r>
       <w:r>
         <w:t xml:space="preserve"> </w:t>
@@ -3443,7 +3443,7 @@
         <w:t xml:space="preserve"> </w:t>
       </w:r>
       <w:r>
-        <w:t xml:space="preserve">(pt-infomed · pt-dl176-2006 · pt-infarmed-circ148-2011 · pt-dl95-2004 · pt-infarmed-manipulados)</w:t>
+        <w:t xml:space="preserve">(INFARMED 2026 · Ministério da Saúde (Portugal) 2006 · INFARMED 2011 · Ministério da Saúde (Portugal); compiled by INFARMED 2004 · INFARMED 2026)</w:t>
       </w:r>
       <w:r>
         <w:t xml:space="preserve"> </w:t>
@@ -3471,7 +3471,7 @@
         <w:t xml:space="preserve"> </w:t>
       </w:r>
       <w:r>
-        <w:t xml:space="preserve">(br-anvisa-peptides-2026 · br-anvisa-medicine-types-2026)</w:t>
+        <w:t xml:space="preserve">(Agência Nacional de Vigilância Sanitária (Anvisa) 2026 · Agência Nacional de Vigilância Sanitária (Anvisa) 2026)</w:t>
       </w:r>
       <w:r>
         <w:t xml:space="preserve"> </w:t>
@@ -3499,7 +3499,7 @@
         <w:t xml:space="preserve"> </w:t>
       </w:r>
       <w:r>
-        <w:t xml:space="preserve">(ae-fdl-38-2024 · ae-dha-cir-peptides-2026 · ae-doh-cir-148-2026)</w:t>
+        <w:t xml:space="preserve">(UAE federal legislation (President of the UAE) 2024 · Dubai Health Authority (DHA) 2026 · Department of Health – Abu Dhabi (DoH) 2026)</w:t>
       </w:r>
     </w:p>
     <w:p>
@@ -3523,7 +3523,7 @@
         <w:pStyle w:val="BodyText"/>
       </w:pPr>
       <w:r>
-        <w:t xml:space="preserve">Sources: Scheffler L 2018 · Camilleri M 2019 · Reynolds A 2019 · Suez J 2019 · Makrgeorgou A 2018 · US Food and Drug Administration 2026 · Aesthetic &amp; Regenerative Endocrinology — A Clinician's Pocket Guide 2026 · ecfr-21-cfr-216-23-bulks-list</w:t>
+        <w:t xml:space="preserve">Sources: Scheffler L 2018 · Camilleri M 2019 · Reynolds A 2019 · Suez J 2019 · Makrgeorgou A 2018 · US Food and Drug Administration 2026 · Aesthetic &amp; Regenerative Endocrinology — A Clinician's Pocket Guide 2026 · US Code of Federal Regulations (eCFR) 2019</w:t>
       </w:r>
     </w:p>
     <w:p>
@@ -3729,7 +3729,7 @@
         <w:t xml:space="preserve"> </w:t>
       </w:r>
       <w:r>
-        <w:t xml:space="preserve">(eu-ema-glp1-shortages-2024 · eu-ema-epar-mounjaro · eu-union-register · eu-ema-medicines-data)</w:t>
+        <w:t xml:space="preserve">(European Medicines Agency and Heads of Medicines Agencies (MSSG) 2024 · European Medicines Agency 2022 · European Commission 2026 · European Medicines Agency 2026)</w:t>
       </w:r>
       <w:r>
         <w:t xml:space="preserve"> </w:t>
@@ -3757,7 +3757,7 @@
         <w:t xml:space="preserve"> </w:t>
       </w:r>
       <w:r>
-        <w:t xml:space="preserve">(br-label-ozempic · br-anvisa-register-opendata · br-label-wegovy · br-anvisa-semaglutide-synthetic-2026 · br-anvisa-semaglutide-five-2026 · br-anvisa-consultas-medicamentos · br-label-mounjaro · br-anvisa-glp1-qa-2025 · br-anvisa-glp1-retention-2025)</w:t>
+        <w:t xml:space="preserve">(Novo Nordisk Farmacêutica do Brasil Ltda (Anvisa-approved package leaflet) 2026 · Agência Nacional de Vigilância Sanitária (Anvisa) 2026 · Novo Nordisk Farmacêutica do Brasil Ltda (Anvisa-approved package leaflet) 2026 · Agência Nacional de Vigilância Sanitária (Anvisa) 2026 · Agência Nacional de Vigilância Sanitária (Anvisa) 2026 · Agência Nacional de Vigilância Sanitária (Anvisa) 2026 · Eli Lilly do Brasil Ltda (Anvisa-approved package leaflet) 2026 · Anvisa – DIRE5/GGMON/GPCON 2025 · Agência Nacional de Vigilância Sanitária (Anvisa) 2025)</w:t>
       </w:r>
       <w:r>
         <w:t xml:space="preserve"> </w:t>
@@ -3785,7 +3785,7 @@
         <w:t xml:space="preserve"> </w:t>
       </w:r>
       <w:r>
-        <w:t xml:space="preserve">(ae-fdl-28-2023 · ae-ede-reg-wegovy · ae-ede-register · ae-ede-reg-mounjaro)</w:t>
+        <w:t xml:space="preserve">(UAE federal legislation (President of the UAE) 2023 · Emirates Drug Establishment (EDE) 2026 · Emirates Drug Establishment (EDE) 2026 · Emirates Drug Establishment (EDE) 2026)</w:t>
       </w:r>
     </w:p>
     <w:p>
@@ -4131,7 +4131,7 @@
         <w:t xml:space="preserve"> </w:t>
       </w:r>
       <w:r>
-        <w:t xml:space="preserve">(eu-ema-glp1-shortages-2024 · eu-ema-epar-ozempic · eu-ema-epar-wegovy · eu-ema-epar-mounjaro · eu-union-register · eu-ema-medicines-data · eu-ema-illegal-glp1-2025)</w:t>
+        <w:t xml:space="preserve">(European Medicines Agency and Heads of Medicines Agencies (MSSG) 2024 · European Medicines Agency 2018 · European Medicines Agency 2022 · European Medicines Agency 2022 · European Commission 2026 · European Medicines Agency 2026 · European Medicines Agency and Heads of Medicines Agencies 2025)</w:t>
       </w:r>
       <w:r>
         <w:t xml:space="preserve"> </w:t>
@@ -4159,7 +4159,7 @@
         <w:t xml:space="preserve"> </w:t>
       </w:r>
       <w:r>
-        <w:t xml:space="preserve">(pt-infomed · pt-infomed-guide · pt-infarmed-circ045-2024 · pt-infarmed-glp1-illegal-2025)</w:t>
+        <w:t xml:space="preserve">(INFARMED 2026 · INFARMED 2026 · INFARMED 2024 · INFARMED 2025)</w:t>
       </w:r>
       <w:r>
         <w:t xml:space="preserve"> </w:t>
@@ -4187,7 +4187,7 @@
         <w:t xml:space="preserve"> </w:t>
       </w:r>
       <w:r>
-        <w:t xml:space="preserve">(br-label-ozempic · br-anvisa-register-opendata · br-label-wegovy · br-label-mounjaro · br-anvisa-consultas-medicamentos · br-anvisa-semaglutide-synthetic-2026 · br-anvisa-semaglutide-five-2026 · br-anvisa-glp1-compounding-2025 · br-anvisa-nt200-2025 · br-anvisa-pf-2026 · br-anvisa-glp1-actionplan-2026)</w:t>
+        <w:t xml:space="preserve">(Novo Nordisk Farmacêutica do Brasil Ltda (Anvisa-approved package leaflet) 2026 · Agência Nacional de Vigilância Sanitária (Anvisa) 2026 · Novo Nordisk Farmacêutica do Brasil Ltda (Anvisa-approved package leaflet) 2026 · Eli Lilly do Brasil Ltda (Anvisa-approved package leaflet) 2026 · Agência Nacional de Vigilância Sanitária (Anvisa) 2026 · Agência Nacional de Vigilância Sanitária (Anvisa) 2026 · Agência Nacional de Vigilância Sanitária (Anvisa) 2026 · Agência Nacional de Vigilância Sanitária (Anvisa) 2025 · Anvisa – GIMED/GGFIS 2025 · Agência Nacional de Vigilância Sanitária (Anvisa) 2026 · Agência Nacional de Vigilância Sanitária (Anvisa) 2026)</w:t>
       </w:r>
       <w:r>
         <w:t xml:space="preserve"> </w:t>
@@ -4215,7 +4215,7 @@
         <w:t xml:space="preserve"> </w:t>
       </w:r>
       <w:r>
-        <w:t xml:space="preserve">(ae-ede-news-oral-wegovy · ae-mohap-cir-9217-2024 · ae-fdl-38-2024 · ae-ede-cir-31-2026)</w:t>
+        <w:t xml:space="preserve">(Emirates Drug Establishment (EDE) 2026 · Ministry of Health and Prevention (MOHAP) 2024 · UAE federal legislation (President of the UAE) 2024 · Emirates Drug Establishment (EDE) 2026)</w:t>
       </w:r>
     </w:p>
     <w:p>
@@ -5029,7 +5029,7 @@
         <w:t xml:space="preserve"> </w:t>
       </w:r>
       <w:r>
-        <w:t xml:space="preserve">(eu-ema-epar-mounjaro · eu-union-register · eu-ema-medicines-data)</w:t>
+        <w:t xml:space="preserve">(European Medicines Agency 2022 · European Commission 2026 · European Medicines Agency 2026)</w:t>
       </w:r>
       <w:r>
         <w:t xml:space="preserve"> </w:t>
@@ -5057,7 +5057,7 @@
         <w:t xml:space="preserve"> </w:t>
       </w:r>
       <w:r>
-        <w:t xml:space="preserve">(br-label-mounjaro · br-anvisa-consultas-medicamentos · br-anvisa-peptides-2026)</w:t>
+        <w:t xml:space="preserve">(Eli Lilly do Brasil Ltda (Anvisa-approved package leaflet) 2026 · Agência Nacional de Vigilância Sanitária (Anvisa) 2026 · Agência Nacional de Vigilância Sanitária (Anvisa) 2026)</w:t>
       </w:r>
       <w:r>
         <w:t xml:space="preserve"> </w:t>
@@ -5085,7 +5085,7 @@
         <w:t xml:space="preserve"> </w:t>
       </w:r>
       <w:r>
-        <w:t xml:space="preserve">(ae-ede-register · ae-mohap-cir-9217-2024 · ae-dha-cir-peptides-2026 · ae-doh-compounding-std-2026)</w:t>
+        <w:t xml:space="preserve">(Emirates Drug Establishment (EDE) 2026 · Ministry of Health and Prevention (MOHAP) 2024 · Dubai Health Authority (DHA) 2026 · Department of Health – Abu Dhabi (DoH) 2026)</w:t>
       </w:r>
     </w:p>
     <w:p>
@@ -5323,7 +5323,7 @@
         <w:t xml:space="preserve"> </w:t>
       </w:r>
       <w:r>
-        <w:t xml:space="preserve">(eu-dir-2001-83)</w:t>
+        <w:t xml:space="preserve">(European Parliament and Council of the European Union 2001)</w:t>
       </w:r>
       <w:r>
         <w:t xml:space="preserve"> </w:t>
@@ -5351,7 +5351,7 @@
         <w:t xml:space="preserve"> </w:t>
       </w:r>
       <w:r>
-        <w:t xml:space="preserve">(pt-infomed · pt-dl176-2006 · pt-infarmed-circ148-2011 · pt-dl95-2004 · pt-infarmed-manipulados)</w:t>
+        <w:t xml:space="preserve">(INFARMED 2026 · Ministério da Saúde (Portugal) 2006 · INFARMED 2011 · Ministério da Saúde (Portugal); compiled by INFARMED 2004 · INFARMED 2026)</w:t>
       </w:r>
       <w:r>
         <w:t xml:space="preserve"> </w:t>
@@ -5379,7 +5379,7 @@
         <w:t xml:space="preserve"> </w:t>
       </w:r>
       <w:r>
-        <w:t xml:space="preserve">(br-anvisa-peptides-2026 · br-anvisa-medicine-types-2026)</w:t>
+        <w:t xml:space="preserve">(Agência Nacional de Vigilância Sanitária (Anvisa) 2026 · Agência Nacional de Vigilância Sanitária (Anvisa) 2026)</w:t>
       </w:r>
       <w:r>
         <w:t xml:space="preserve"> </w:t>
@@ -5407,7 +5407,7 @@
         <w:t xml:space="preserve"> </w:t>
       </w:r>
       <w:r>
-        <w:t xml:space="preserve">(ae-fdl-38-2024 · ae-dha-cir-peptides-2026 · ae-doh-cir-148-2026)</w:t>
+        <w:t xml:space="preserve">(UAE federal legislation (President of the UAE) 2024 · Dubai Health Authority (DHA) 2026 · Department of Health – Abu Dhabi (DoH) 2026)</w:t>
       </w:r>
     </w:p>
     <w:p>
@@ -5431,7 +5431,7 @@
         <w:pStyle w:val="BodyText"/>
       </w:pPr>
       <w:r>
-        <w:t xml:space="preserve">Sources: Scheffler L 2018 · Camilleri M 2019 · Reynolds A 2019 · Suez J 2019 · Makrgeorgou A 2018 · US Food and Drug Administration 2026 · Aesthetic &amp; Regenerative Endocrinology — A Clinician's Pocket Guide 2026 · ecfr-21-cfr-216-23-bulks-list</w:t>
+        <w:t xml:space="preserve">Sources: Scheffler L 2018 · Camilleri M 2019 · Reynolds A 2019 · Suez J 2019 · Makrgeorgou A 2018 · US Food and Drug Administration 2026 · Aesthetic &amp; Regenerative Endocrinology — A Clinician's Pocket Guide 2026 · US Code of Federal Regulations (eCFR) 2019</w:t>
       </w:r>
     </w:p>
     <w:p>
@@ -5679,7 +5679,7 @@
         <w:t xml:space="preserve"> </w:t>
       </w:r>
       <w:r>
-        <w:t xml:space="preserve">(eu-dir-2001-83)</w:t>
+        <w:t xml:space="preserve">(European Parliament and Council of the European Union 2001)</w:t>
       </w:r>
       <w:r>
         <w:t xml:space="preserve"> </w:t>
@@ -5707,7 +5707,7 @@
         <w:t xml:space="preserve"> </w:t>
       </w:r>
       <w:r>
-        <w:t xml:space="preserve">(pt-infomed · pt-dl176-2006 · pt-infarmed-circ148-2011 · pt-dl95-2004 · pt-infarmed-manipulados)</w:t>
+        <w:t xml:space="preserve">(INFARMED 2026 · Ministério da Saúde (Portugal) 2006 · INFARMED 2011 · Ministério da Saúde (Portugal); compiled by INFARMED 2004 · INFARMED 2026)</w:t>
       </w:r>
       <w:r>
         <w:t xml:space="preserve"> </w:t>
@@ -5735,7 +5735,7 @@
         <w:t xml:space="preserve"> </w:t>
       </w:r>
       <w:r>
-        <w:t xml:space="preserve">(br-anvisa-peptides-2026 · br-anvisa-medicine-types-2026)</w:t>
+        <w:t xml:space="preserve">(Agência Nacional de Vigilância Sanitária (Anvisa) 2026 · Agência Nacional de Vigilância Sanitária (Anvisa) 2026)</w:t>
       </w:r>
       <w:r>
         <w:t xml:space="preserve"> </w:t>
@@ -5763,7 +5763,7 @@
         <w:t xml:space="preserve"> </w:t>
       </w:r>
       <w:r>
-        <w:t xml:space="preserve">(ae-fdl-38-2024 · ae-dha-cir-peptides-2026 · ae-doh-cir-148-2026)</w:t>
+        <w:t xml:space="preserve">(UAE federal legislation (President of the UAE) 2024 · Dubai Health Authority (DHA) 2026 · Department of Health – Abu Dhabi (DoH) 2026)</w:t>
       </w:r>
     </w:p>
     <w:p>
@@ -5787,7 +5787,7 @@
         <w:pStyle w:val="BodyText"/>
       </w:pPr>
       <w:r>
-        <w:t xml:space="preserve">Sources: Scheffler L 2018 · Camilleri M 2019 · Reynolds A 2019 · Suez J 2019 · Makrgeorgou A 2018 · US Food and Drug Administration 2026 · Aesthetic &amp; Regenerative Endocrinology — A Clinician's Pocket Guide 2026 · ecfr-21-cfr-216-23-bulks-list</w:t>
+        <w:t xml:space="preserve">Sources: Scheffler L 2018 · Camilleri M 2019 · Reynolds A 2019 · Suez J 2019 · Makrgeorgou A 2018 · US Food and Drug Administration 2026 · Aesthetic &amp; Regenerative Endocrinology — A Clinician's Pocket Guide 2026 · US Code of Federal Regulations (eCFR) 2019</w:t>
       </w:r>
     </w:p>
     <w:bookmarkEnd w:id="27"/>
@@ -6084,7 +6084,7 @@
         <w:t xml:space="preserve"> </w:t>
       </w:r>
       <w:r>
-        <w:t xml:space="preserve">(eu-cosing-copper-tripeptide-1 · eu-cosing-home · eu-ema-medicines-data · eu-union-register)</w:t>
+        <w:t xml:space="preserve">(European Commission 2026 · European Commission 2026 · European Medicines Agency 2026 · European Commission 2026)</w:t>
       </w:r>
       <w:r>
         <w:t xml:space="preserve"> </w:t>
@@ -6112,7 +6112,7 @@
         <w:t xml:space="preserve"> </w:t>
       </w:r>
       <w:r>
-        <w:t xml:space="preserve">(pt-infomed)</w:t>
+        <w:t xml:space="preserve">(INFARMED 2026)</w:t>
       </w:r>
       <w:r>
         <w:t xml:space="preserve"> </w:t>
@@ -6140,7 +6140,7 @@
         <w:t xml:space="preserve"> </w:t>
       </w:r>
       <w:r>
-        <w:t xml:space="preserve">(br-anvisa-peptides-2026)</w:t>
+        <w:t xml:space="preserve">(Agência Nacional de Vigilância Sanitária (Anvisa) 2026)</w:t>
       </w:r>
       <w:r>
         <w:t xml:space="preserve"> </w:t>
@@ -6168,7 +6168,7 @@
         <w:t xml:space="preserve"> </w:t>
       </w:r>
       <w:r>
-        <w:t xml:space="preserve">(ae-fdl-28-2023 · ae-ede-register · ae-dha-cir-peptides-2026 · ae-doh-cir-148-2026)</w:t>
+        <w:t xml:space="preserve">(UAE federal legislation (President of the UAE) 2023 · Emirates Drug Establishment (EDE) 2026 · Dubai Health Authority (DHA) 2026 · Department of Health – Abu Dhabi (DoH) 2026)</w:t>
       </w:r>
     </w:p>
     <w:p>
@@ -6406,7 +6406,7 @@
         <w:t xml:space="preserve"> </w:t>
       </w:r>
       <w:r>
-        <w:t xml:space="preserve">(eu-reg-1223-2009 · eu-ec-cosmetics-borderline-manual-2025 · eu-reg-1223-2009-oj)</w:t>
+        <w:t xml:space="preserve">(European Parliament and Council of the European Union 2009 · Working Group on Cosmetic Products (European Commission and member states) 2025 · European Parliament and Council of the European Union 2009)</w:t>
       </w:r>
       <w:r>
         <w:t xml:space="preserve"> </w:t>
@@ -6434,7 +6434,7 @@
         <w:t xml:space="preserve"> </w:t>
       </w:r>
       <w:r>
-        <w:t xml:space="preserve">(pt-infarmed-cosmetics-faq · pt-dl176-2006)</w:t>
+        <w:t xml:space="preserve">(INFARMED 2026 · Ministério da Saúde (Portugal) 2006)</w:t>
       </w:r>
       <w:r>
         <w:t xml:space="preserve"> </w:t>
@@ -6462,7 +6462,7 @@
         <w:t xml:space="preserve"> </w:t>
       </w:r>
       <w:r>
-        <w:t xml:space="preserve">(br-anvisa-peptides-2026 · br-anvisa-cosmetics-opendata · br-dou-re-1771-2026)</w:t>
+        <w:t xml:space="preserve">(Agência Nacional de Vigilância Sanitária (Anvisa) 2026 · Agência Nacional de Vigilância Sanitária (Anvisa) 2026 · Anvisa – Gerência-Geral de Cosméticos e Saneantes 2026)</w:t>
       </w:r>
       <w:r>
         <w:t xml:space="preserve"> </w:t>
@@ -6490,7 +6490,7 @@
         <w:t xml:space="preserve"> </w:t>
       </w:r>
       <w:r>
-        <w:t xml:space="preserve">(ae-fdl-38-2024 · ae-ede-svc-classification · ae-dha-cir-peptides-2026 · ae-doh-cir-148-2026)</w:t>
+        <w:t xml:space="preserve">(UAE federal legislation (President of the UAE) 2024 · Emirates Drug Establishment (EDE) 2026 · Dubai Health Authority (DHA) 2026 · Department of Health – Abu Dhabi (DoH) 2026)</w:t>
       </w:r>
     </w:p>
     <w:p>
@@ -6744,7 +6744,7 @@
         <w:t xml:space="preserve"> </w:t>
       </w:r>
       <w:r>
-        <w:t xml:space="preserve">(eu-reg-1223-2009 · eu-reg-655-2013 · eu-reg-1169-2011 · eu-reg-1924-2006 · eu-reg-1154-2014 · eu-claims-register)</w:t>
+        <w:t xml:space="preserve">(European Parliament and Council of the European Union 2009 · European Commission 2013 · European Parliament and Council of the European Union 2011 · European Parliament and Council of the European Union 2006 · European Commission 2014 · European Commission 2026)</w:t>
       </w:r>
       <w:r>
         <w:t xml:space="preserve"> </w:t>
@@ -6772,7 +6772,7 @@
         <w:t xml:space="preserve"> </w:t>
       </w:r>
       <w:r>
-        <w:t xml:space="preserve">(pt-dl23-2025 · pt-infarmed-cosmetics-faq · pt-dgav-notification · pt-dgav-supplements)</w:t>
+        <w:t xml:space="preserve">(Presidência do Conselho de Ministros / Governo de Portugal 2025 · INFARMED 2026 · Direção-Geral de Alimentação e Veterinária (DGAV) 2026 · Direção-Geral de Alimentação e Veterinária (DGAV) 2026)</w:t>
       </w:r>
       <w:r>
         <w:t xml:space="preserve"> </w:t>
@@ -6800,7 +6800,7 @@
         <w:t xml:space="preserve"> </w:t>
       </w:r>
       <w:r>
-        <w:t xml:space="preserve">(br-rdc-907-2024 · br-anvisa-supplements-ingredients · br-anvisa-supplements-qa-2025 · br-rdc-243-2018)</w:t>
+        <w:t xml:space="preserve">(Anvisa – Diretoria Colegiada 2024 · Agência Nacional de Vigilância Sanitária (Anvisa) 2026 · Anvisa – Gerência-Geral de Alimentos 2025 · Anvisa – Diretoria Colegiada 2018)</w:t>
       </w:r>
       <w:r>
         <w:t xml:space="preserve"> </w:t>
@@ -6828,7 +6828,7 @@
         <w:t xml:space="preserve"> </w:t>
       </w:r>
       <w:r>
-        <w:t xml:space="preserve">(ae-fdl-38-2024 · ae-ede-svc-healthcare-product · ae-ede-reg-collafix · ae-ede-reg-centrum-shn · ae-ede-register · ae-moiat-regulated-products · ae-moiat-ecas-service · ae-dha-cir-peptides-2026 · ae-doh-cir-148-2026)</w:t>
+        <w:t xml:space="preserve">(UAE federal legislation (President of the UAE) 2024 · Emirates Drug Establishment (EDE) 2026 · Emirates Drug Establishment (EDE) 2026 · Emirates Drug Establishment (EDE) 2026 · Emirates Drug Establishment (EDE) 2026 · Ministry of Industry and Advanced Technology (MoIAT) 2022 · Ministry of Industry and Advanced Technology (MoIAT) 2026 · Dubai Health Authority (DHA) 2026 · Department of Health – Abu Dhabi (DoH) 2026)</w:t>
       </w:r>
     </w:p>
     <w:p>
@@ -7314,7 +7314,7 @@
         <w:t xml:space="preserve"> </w:t>
       </w:r>
       <w:r>
-        <w:t xml:space="preserve">(eu-dir-2001-83 · eu-ema-medicines-data · eu-union-register)</w:t>
+        <w:t xml:space="preserve">(European Parliament and Council of the European Union 2001 · European Medicines Agency 2026 · European Commission 2026)</w:t>
       </w:r>
       <w:r>
         <w:t xml:space="preserve"> </w:t>
@@ -7342,7 +7342,7 @@
         <w:t xml:space="preserve"> </w:t>
       </w:r>
       <w:r>
-        <w:t xml:space="preserve">(pt-dl95-2004 · pt-infarmed-manipulados)</w:t>
+        <w:t xml:space="preserve">(Ministério da Saúde (Portugal); compiled by INFARMED 2004 · INFARMED 2026)</w:t>
       </w:r>
       <w:r>
         <w:t xml:space="preserve"> </w:t>
@@ -7370,7 +7370,7 @@
         <w:t xml:space="preserve"> </w:t>
       </w:r>
       <w:r>
-        <w:t xml:space="preserve">(br-anvisa-peptides-2026)</w:t>
+        <w:t xml:space="preserve">(Agência Nacional de Vigilância Sanitária (Anvisa) 2026)</w:t>
       </w:r>
       <w:r>
         <w:t xml:space="preserve"> </w:t>
@@ -7398,7 +7398,7 @@
         <w:t xml:space="preserve"> </w:t>
       </w:r>
       <w:r>
-        <w:t xml:space="preserve">(ae-fdl-38-2024 · ae-dha-cir-peptides-2026 · ae-doh-compounding-std-2026)</w:t>
+        <w:t xml:space="preserve">(UAE federal legislation (President of the UAE) 2024 · Dubai Health Authority (DHA) 2026 · Department of Health – Abu Dhabi (DoH) 2026)</w:t>
       </w:r>
     </w:p>
     <w:p>
@@ -7915,7 +7915,7 @@
         <w:t xml:space="preserve"> </w:t>
       </w:r>
       <w:r>
-        <w:t xml:space="preserve">(eu-cosing-copper-tripeptide-1 · eu-cosing-home · eu-ema-medicines-data · eu-union-register)</w:t>
+        <w:t xml:space="preserve">(European Commission 2026 · European Commission 2026 · European Medicines Agency 2026 · European Commission 2026)</w:t>
       </w:r>
       <w:r>
         <w:t xml:space="preserve"> </w:t>
@@ -7943,7 +7943,7 @@
         <w:t xml:space="preserve"> </w:t>
       </w:r>
       <w:r>
-        <w:t xml:space="preserve">(pt-infomed)</w:t>
+        <w:t xml:space="preserve">(INFARMED 2026)</w:t>
       </w:r>
       <w:r>
         <w:t xml:space="preserve"> </w:t>
@@ -7971,7 +7971,7 @@
         <w:t xml:space="preserve"> </w:t>
       </w:r>
       <w:r>
-        <w:t xml:space="preserve">(br-anvisa-peptides-2026)</w:t>
+        <w:t xml:space="preserve">(Agência Nacional de Vigilância Sanitária (Anvisa) 2026)</w:t>
       </w:r>
       <w:r>
         <w:t xml:space="preserve"> </w:t>
@@ -7999,7 +7999,7 @@
         <w:t xml:space="preserve"> </w:t>
       </w:r>
       <w:r>
-        <w:t xml:space="preserve">(ae-fdl-28-2023 · ae-ede-register · ae-dha-cir-peptides-2026 · ae-doh-cir-148-2026)</w:t>
+        <w:t xml:space="preserve">(UAE federal legislation (President of the UAE) 2023 · Emirates Drug Establishment (EDE) 2026 · Dubai Health Authority (DHA) 2026 · Department of Health – Abu Dhabi (DoH) 2026)</w:t>
       </w:r>
     </w:p>
     <w:p>
@@ -8237,7 +8237,7 @@
         <w:t xml:space="preserve"> </w:t>
       </w:r>
       <w:r>
-        <w:t xml:space="preserve">(eu-reg-1223-2009 · eu-ec-cosmetics-borderline-manual-2025 · eu-reg-1223-2009-oj)</w:t>
+        <w:t xml:space="preserve">(European Parliament and Council of the European Union 2009 · Working Group on Cosmetic Products (European Commission and member states) 2025 · European Parliament and Council of the European Union 2009)</w:t>
       </w:r>
       <w:r>
         <w:t xml:space="preserve"> </w:t>
@@ -8265,7 +8265,7 @@
         <w:t xml:space="preserve"> </w:t>
       </w:r>
       <w:r>
-        <w:t xml:space="preserve">(pt-infarmed-cosmetics-faq · pt-dl176-2006)</w:t>
+        <w:t xml:space="preserve">(INFARMED 2026 · Ministério da Saúde (Portugal) 2006)</w:t>
       </w:r>
       <w:r>
         <w:t xml:space="preserve"> </w:t>
@@ -8293,7 +8293,7 @@
         <w:t xml:space="preserve"> </w:t>
       </w:r>
       <w:r>
-        <w:t xml:space="preserve">(br-anvisa-peptides-2026 · br-anvisa-cosmetics-opendata · br-dou-re-1771-2026)</w:t>
+        <w:t xml:space="preserve">(Agência Nacional de Vigilância Sanitária (Anvisa) 2026 · Agência Nacional de Vigilância Sanitária (Anvisa) 2026 · Anvisa – Gerência-Geral de Cosméticos e Saneantes 2026)</w:t>
       </w:r>
       <w:r>
         <w:t xml:space="preserve"> </w:t>
@@ -8321,7 +8321,7 @@
         <w:t xml:space="preserve"> </w:t>
       </w:r>
       <w:r>
-        <w:t xml:space="preserve">(ae-fdl-38-2024 · ae-ede-svc-classification · ae-dha-cir-peptides-2026 · ae-doh-cir-148-2026)</w:t>
+        <w:t xml:space="preserve">(UAE federal legislation (President of the UAE) 2024 · Emirates Drug Establishment (EDE) 2026 · Dubai Health Authority (DHA) 2026 · Department of Health – Abu Dhabi (DoH) 2026)</w:t>
       </w:r>
     </w:p>
     <w:p>
@@ -8575,7 +8575,7 @@
         <w:t xml:space="preserve"> </w:t>
       </w:r>
       <w:r>
-        <w:t xml:space="preserve">(eu-reg-1223-2009 · eu-reg-655-2013 · eu-reg-1169-2011 · eu-reg-1924-2006 · eu-reg-1154-2014 · eu-claims-register)</w:t>
+        <w:t xml:space="preserve">(European Parliament and Council of the European Union 2009 · European Commission 2013 · European Parliament and Council of the European Union 2011 · European Parliament and Council of the European Union 2006 · European Commission 2014 · European Commission 2026)</w:t>
       </w:r>
       <w:r>
         <w:t xml:space="preserve"> </w:t>
@@ -8603,7 +8603,7 @@
         <w:t xml:space="preserve"> </w:t>
       </w:r>
       <w:r>
-        <w:t xml:space="preserve">(pt-dl23-2025 · pt-infarmed-cosmetics-faq · pt-dgav-notification · pt-dgav-supplements)</w:t>
+        <w:t xml:space="preserve">(Presidência do Conselho de Ministros / Governo de Portugal 2025 · INFARMED 2026 · Direção-Geral de Alimentação e Veterinária (DGAV) 2026 · Direção-Geral de Alimentação e Veterinária (DGAV) 2026)</w:t>
       </w:r>
       <w:r>
         <w:t xml:space="preserve"> </w:t>
@@ -8631,7 +8631,7 @@
         <w:t xml:space="preserve"> </w:t>
       </w:r>
       <w:r>
-        <w:t xml:space="preserve">(br-rdc-907-2024 · br-anvisa-supplements-ingredients · br-anvisa-supplements-qa-2025 · br-rdc-243-2018)</w:t>
+        <w:t xml:space="preserve">(Anvisa – Diretoria Colegiada 2024 · Agência Nacional de Vigilância Sanitária (Anvisa) 2026 · Anvisa – Gerência-Geral de Alimentos 2025 · Anvisa – Diretoria Colegiada 2018)</w:t>
       </w:r>
       <w:r>
         <w:t xml:space="preserve"> </w:t>
@@ -8659,7 +8659,7 @@
         <w:t xml:space="preserve"> </w:t>
       </w:r>
       <w:r>
-        <w:t xml:space="preserve">(ae-fdl-38-2024 · ae-ede-svc-healthcare-product · ae-ede-reg-collafix · ae-ede-reg-centrum-shn · ae-ede-register · ae-moiat-regulated-products · ae-moiat-ecas-service · ae-dha-cir-peptides-2026 · ae-doh-cir-148-2026)</w:t>
+        <w:t xml:space="preserve">(UAE federal legislation (President of the UAE) 2024 · Emirates Drug Establishment (EDE) 2026 · Emirates Drug Establishment (EDE) 2026 · Emirates Drug Establishment (EDE) 2026 · Emirates Drug Establishment (EDE) 2026 · Ministry of Industry and Advanced Technology (MoIAT) 2022 · Ministry of Industry and Advanced Technology (MoIAT) 2026 · Dubai Health Authority (DHA) 2026 · Department of Health – Abu Dhabi (DoH) 2026)</w:t>
       </w:r>
     </w:p>
     <w:p>
@@ -9145,7 +9145,7 @@
         <w:t xml:space="preserve"> </w:t>
       </w:r>
       <w:r>
-        <w:t xml:space="preserve">(eu-dir-2001-83 · eu-ema-medicines-data · eu-union-register)</w:t>
+        <w:t xml:space="preserve">(European Parliament and Council of the European Union 2001 · European Medicines Agency 2026 · European Commission 2026)</w:t>
       </w:r>
       <w:r>
         <w:t xml:space="preserve"> </w:t>
@@ -9173,7 +9173,7 @@
         <w:t xml:space="preserve"> </w:t>
       </w:r>
       <w:r>
-        <w:t xml:space="preserve">(pt-dl95-2004 · pt-infarmed-manipulados)</w:t>
+        <w:t xml:space="preserve">(Ministério da Saúde (Portugal); compiled by INFARMED 2004 · INFARMED 2026)</w:t>
       </w:r>
       <w:r>
         <w:t xml:space="preserve"> </w:t>
@@ -9201,7 +9201,7 @@
         <w:t xml:space="preserve"> </w:t>
       </w:r>
       <w:r>
-        <w:t xml:space="preserve">(br-anvisa-peptides-2026)</w:t>
+        <w:t xml:space="preserve">(Agência Nacional de Vigilância Sanitária (Anvisa) 2026)</w:t>
       </w:r>
       <w:r>
         <w:t xml:space="preserve"> </w:t>
@@ -9229,7 +9229,7 @@
         <w:t xml:space="preserve"> </w:t>
       </w:r>
       <w:r>
-        <w:t xml:space="preserve">(ae-fdl-38-2024 · ae-dha-cir-peptides-2026 · ae-doh-compounding-std-2026)</w:t>
+        <w:t xml:space="preserve">(UAE federal legislation (President of the UAE) 2024 · Dubai Health Authority (DHA) 2026 · Department of Health – Abu Dhabi (DoH) 2026)</w:t>
       </w:r>
     </w:p>
     <w:p>
@@ -9539,7 +9539,7 @@
         <w:t xml:space="preserve"> </w:t>
       </w:r>
       <w:r>
-        <w:t xml:space="preserve">(eu-dir-2001-83)</w:t>
+        <w:t xml:space="preserve">(European Parliament and Council of the European Union 2001)</w:t>
       </w:r>
       <w:r>
         <w:t xml:space="preserve"> </w:t>
@@ -9567,7 +9567,7 @@
         <w:t xml:space="preserve"> </w:t>
       </w:r>
       <w:r>
-        <w:t xml:space="preserve">(pt-dl176-2006 · pt-infomed · pt-infarmed-circ148-2011)</w:t>
+        <w:t xml:space="preserve">(Ministério da Saúde (Portugal) 2006 · INFARMED 2026 · INFARMED 2011)</w:t>
       </w:r>
       <w:r>
         <w:t xml:space="preserve"> </w:t>
@@ -9595,7 +9595,7 @@
         <w:t xml:space="preserve"> </w:t>
       </w:r>
       <w:r>
-        <w:t xml:space="preserve">(br-anvisa-peptides-2026 · br-anvisa-medicine-types-2026)</w:t>
+        <w:t xml:space="preserve">(Agência Nacional de Vigilância Sanitária (Anvisa) 2026 · Agência Nacional de Vigilância Sanitária (Anvisa) 2026)</w:t>
       </w:r>
       <w:r>
         <w:t xml:space="preserve"> </w:t>
@@ -9623,7 +9623,7 @@
         <w:t xml:space="preserve"> </w:t>
       </w:r>
       <w:r>
-        <w:t xml:space="preserve">(ae-fdl-38-2024 · ae-ede-register · ae-dha-cir-peptides-2026 · ae-doh-cir-148-2026)</w:t>
+        <w:t xml:space="preserve">(UAE federal legislation (President of the UAE) 2024 · Emirates Drug Establishment (EDE) 2026 · Dubai Health Authority (DHA) 2026 · Department of Health – Abu Dhabi (DoH) 2026)</w:t>
       </w:r>
     </w:p>
     <w:p>
@@ -10060,7 +10060,7 @@
         <w:t xml:space="preserve"> </w:t>
       </w:r>
       <w:r>
-        <w:t xml:space="preserve">(eu-cosing-copper-tripeptide-1 · eu-cosing-home · eu-ema-medicines-data · eu-union-register)</w:t>
+        <w:t xml:space="preserve">(European Commission 2026 · European Commission 2026 · European Medicines Agency 2026 · European Commission 2026)</w:t>
       </w:r>
       <w:r>
         <w:t xml:space="preserve"> </w:t>
@@ -10088,7 +10088,7 @@
         <w:t xml:space="preserve"> </w:t>
       </w:r>
       <w:r>
-        <w:t xml:space="preserve">(pt-infomed)</w:t>
+        <w:t xml:space="preserve">(INFARMED 2026)</w:t>
       </w:r>
       <w:r>
         <w:t xml:space="preserve"> </w:t>
@@ -10116,7 +10116,7 @@
         <w:t xml:space="preserve"> </w:t>
       </w:r>
       <w:r>
-        <w:t xml:space="preserve">(br-anvisa-peptides-2026)</w:t>
+        <w:t xml:space="preserve">(Agência Nacional de Vigilância Sanitária (Anvisa) 2026)</w:t>
       </w:r>
       <w:r>
         <w:t xml:space="preserve"> </w:t>
@@ -10144,7 +10144,7 @@
         <w:t xml:space="preserve"> </w:t>
       </w:r>
       <w:r>
-        <w:t xml:space="preserve">(ae-fdl-28-2023 · ae-ede-register · ae-dha-cir-peptides-2026 · ae-doh-cir-148-2026)</w:t>
+        <w:t xml:space="preserve">(UAE federal legislation (President of the UAE) 2023 · Emirates Drug Establishment (EDE) 2026 · Dubai Health Authority (DHA) 2026 · Department of Health – Abu Dhabi (DoH) 2026)</w:t>
       </w:r>
     </w:p>
     <w:p>
@@ -10328,7 +10328,7 @@
         <w:t xml:space="preserve"> </w:t>
       </w:r>
       <w:r>
-        <w:t xml:space="preserve">(eu-ema-epar-olumiant · eu-ema-ref-jaki-2023)</w:t>
+        <w:t xml:space="preserve">(European Medicines Agency 2017 · European Medicines Agency 2023)</w:t>
       </w:r>
       <w:r>
         <w:t xml:space="preserve"> </w:t>
@@ -10356,7 +10356,7 @@
         <w:t xml:space="preserve"> </w:t>
       </w:r>
       <w:r>
-        <w:t xml:space="preserve">(pt-infomed · pt-dl176-2006)</w:t>
+        <w:t xml:space="preserve">(INFARMED 2026 · Ministério da Saúde (Portugal) 2006)</w:t>
       </w:r>
       <w:r>
         <w:t xml:space="preserve"> </w:t>
@@ -10384,7 +10384,7 @@
         <w:t xml:space="preserve"> </w:t>
       </w:r>
       <w:r>
-        <w:t xml:space="preserve">(br-label-olumiant · br-anvisa-register-opendata)</w:t>
+        <w:t xml:space="preserve">(Eli Lilly do Brasil Ltda (Anvisa-approved package leaflet) 2026 · Agência Nacional de Vigilância Sanitária (Anvisa) 2026)</w:t>
       </w:r>
       <w:r>
         <w:t xml:space="preserve"> </w:t>
@@ -10412,7 +10412,7 @@
         <w:t xml:space="preserve"> </w:t>
       </w:r>
       <w:r>
-        <w:t xml:space="preserve">(ae-fdl-28-2023 · ae-fdl-38-2024 · ae-ede-reg-olumiant)</w:t>
+        <w:t xml:space="preserve">(UAE federal legislation (President of the UAE) 2023 · UAE federal legislation (President of the UAE) 2024 · Emirates Drug Establishment (EDE) 2026)</w:t>
       </w:r>
     </w:p>
     <w:p>
@@ -10650,7 +10650,7 @@
         <w:t xml:space="preserve"> </w:t>
       </w:r>
       <w:r>
-        <w:t xml:space="preserve">(eu-ema-psusa-minoxidil-2024 · eu-union-register · eu-ema-medicines-data · eu-ema-ref-finasteride-2025 · eu-ema-epar-olumiant)</w:t>
+        <w:t xml:space="preserve">(European Medicines Agency / CMDh 2024 · European Commission 2026 · European Medicines Agency 2026 · European Medicines Agency 2025 · European Medicines Agency 2017)</w:t>
       </w:r>
       <w:r>
         <w:t xml:space="preserve"> </w:t>
@@ -10678,7 +10678,7 @@
         <w:t xml:space="preserve"> </w:t>
       </w:r>
       <w:r>
-        <w:t xml:space="preserve">(pt-infomed · pt-rcm-minox5 · pt-dl176-2006)</w:t>
+        <w:t xml:space="preserve">(INFARMED 2026 · Laboratório Edol / INFARMED 2026 · Ministério da Saúde (Portugal) 2006)</w:t>
       </w:r>
       <w:r>
         <w:t xml:space="preserve"> </w:t>
@@ -10706,7 +10706,7 @@
         <w:t xml:space="preserve"> </w:t>
       </w:r>
       <w:r>
-        <w:t xml:space="preserve">(br-label-aloxidil · br-anvisa-register-opendata · br-label-prohair · br-label-olumiant)</w:t>
+        <w:t xml:space="preserve">(Theraskin Farmacêutica Ltda (Anvisa-approved package leaflet) 2025 · Agência Nacional de Vigilância Sanitária (Anvisa) 2026 · União Química Farmacêutica Nacional S/A (Anvisa-approved package leaflet) 2021 · Eli Lilly do Brasil Ltda (Anvisa-approved package leaflet) 2026)</w:t>
       </w:r>
       <w:r>
         <w:t xml:space="preserve"> </w:t>
@@ -10734,7 +10734,7 @@
         <w:t xml:space="preserve"> </w:t>
       </w:r>
       <w:r>
-        <w:t xml:space="preserve">(ae-fdl-28-2023 · ae-fdl-38-2024 · ae-ede-reg-regaine · ae-ede-register · ae-ede-reg-propecia · ae-ede-reg-fincrezo · ae-ede-reg-olumiant)</w:t>
+        <w:t xml:space="preserve">(UAE federal legislation (President of the UAE) 2023 · UAE federal legislation (President of the UAE) 2024 · Emirates Drug Establishment (EDE) 2026 · Emirates Drug Establishment (EDE) 2026 · Emirates Drug Establishment (EDE) 2026 · Emirates Drug Establishment (EDE) 2026 · Emirates Drug Establishment (EDE) 2026)</w:t>
       </w:r>
     </w:p>
     <w:p>
@@ -11045,7 +11045,7 @@
         <w:t xml:space="preserve"> </w:t>
       </w:r>
       <w:r>
-        <w:t xml:space="preserve">(eu-ema-epar-scenesse · eu-union-register)</w:t>
+        <w:t xml:space="preserve">(European Medicines Agency 2014 · European Commission 2026)</w:t>
       </w:r>
       <w:r>
         <w:t xml:space="preserve"> </w:t>
@@ -11073,7 +11073,7 @@
         <w:t xml:space="preserve"> </w:t>
       </w:r>
       <w:r>
-        <w:t xml:space="preserve">(pt-infomed · pt-dl176-2006)</w:t>
+        <w:t xml:space="preserve">(INFARMED 2026 · Ministério da Saúde (Portugal) 2006)</w:t>
       </w:r>
       <w:r>
         <w:t xml:space="preserve"> </w:t>
@@ -11101,7 +11101,7 @@
         <w:t xml:space="preserve"> </w:t>
       </w:r>
       <w:r>
-        <w:t xml:space="preserve">(br-anvisa-register-opendata · br-anvisa-register-dictionary · br-anvisa-consultas-medicamentos)</w:t>
+        <w:t xml:space="preserve">(Agência Nacional de Vigilância Sanitária (Anvisa) 2026 · Agência Nacional de Vigilância Sanitária (Anvisa) 2026 · Agência Nacional de Vigilância Sanitária (Anvisa) 2026)</w:t>
       </w:r>
       <w:r>
         <w:t xml:space="preserve"> </w:t>
@@ -11129,7 +11129,7 @@
         <w:t xml:space="preserve"> </w:t>
       </w:r>
       <w:r>
-        <w:t xml:space="preserve">(ae-fdl-28-2023 · ae-fdl-38-2024 · ae-ede-register)</w:t>
+        <w:t xml:space="preserve">(UAE federal legislation (President of the UAE) 2023 · UAE federal legislation (President of the UAE) 2024 · Emirates Drug Establishment (EDE) 2026)</w:t>
       </w:r>
     </w:p>
     <w:p>
@@ -11361,7 +11361,7 @@
         <w:t xml:space="preserve"> </w:t>
       </w:r>
       <w:r>
-        <w:t xml:space="preserve">(eu-ema-medicines-data · eu-union-register)</w:t>
+        <w:t xml:space="preserve">(European Medicines Agency 2026 · European Commission 2026)</w:t>
       </w:r>
       <w:r>
         <w:t xml:space="preserve"> </w:t>
@@ -11389,7 +11389,7 @@
         <w:t xml:space="preserve"> </w:t>
       </w:r>
       <w:r>
-        <w:t xml:space="preserve">(pt-infomed)</w:t>
+        <w:t xml:space="preserve">(INFARMED 2026)</w:t>
       </w:r>
       <w:r>
         <w:t xml:space="preserve"> </w:t>
@@ -11417,7 +11417,7 @@
         <w:t xml:space="preserve"> </w:t>
       </w:r>
       <w:r>
-        <w:t xml:space="preserve">(br-anvisa-register-opendata · br-anvisa-register-dictionary · br-anvisa-consultas-medicamentos · br-lei-6360-1976)</w:t>
+        <w:t xml:space="preserve">(Agência Nacional de Vigilância Sanitária (Anvisa) 2026 · Agência Nacional de Vigilância Sanitária (Anvisa) 2026 · Agência Nacional de Vigilância Sanitária (Anvisa) 2026 · Presidência da República 1976)</w:t>
       </w:r>
       <w:r>
         <w:t xml:space="preserve"> </w:t>
@@ -11445,7 +11445,7 @@
         <w:t xml:space="preserve"> </w:t>
       </w:r>
       <w:r>
-        <w:t xml:space="preserve">(ae-fdl-28-2023 · ae-fdl-38-2024 · ae-doh-cir-112-2025 · ae-ede-register · ae-dha-cir-melanotan-2025)</w:t>
+        <w:t xml:space="preserve">(UAE federal legislation (President of the UAE) 2023 · UAE federal legislation (President of the UAE) 2024 · Department of Health – Abu Dhabi (DoH) 2025 · Emirates Drug Establishment (EDE) 2026 · Dubai Health Authority (DHA) 2025)</w:t>
       </w:r>
     </w:p>
     <w:p>
@@ -11683,7 +11683,7 @@
         <w:t xml:space="preserve"> </w:t>
       </w:r>
       <w:r>
-        <w:t xml:space="preserve">(eu-dir-2001-83 · eu-ema-medicines-data · eu-union-register)</w:t>
+        <w:t xml:space="preserve">(European Parliament and Council of the European Union 2001 · European Medicines Agency 2026 · European Commission 2026)</w:t>
       </w:r>
       <w:r>
         <w:t xml:space="preserve"> </w:t>
@@ -11711,7 +11711,7 @@
         <w:t xml:space="preserve"> </w:t>
       </w:r>
       <w:r>
-        <w:t xml:space="preserve">(pt-dl95-2004 · pt-infarmed-manipulados · pt-infomed)</w:t>
+        <w:t xml:space="preserve">(Ministério da Saúde (Portugal); compiled by INFARMED 2004 · INFARMED 2026 · INFARMED 2026)</w:t>
       </w:r>
       <w:r>
         <w:t xml:space="preserve"> </w:t>
@@ -11739,7 +11739,7 @@
         <w:t xml:space="preserve"> </w:t>
       </w:r>
       <w:r>
-        <w:t xml:space="preserve">(br-anvisa-peptides-2026 · br-anvisa-register-opendata · br-anvisa-register-dictionary)</w:t>
+        <w:t xml:space="preserve">(Agência Nacional de Vigilância Sanitária (Anvisa) 2026 · Agência Nacional de Vigilância Sanitária (Anvisa) 2026 · Agência Nacional de Vigilância Sanitária (Anvisa) 2026)</w:t>
       </w:r>
       <w:r>
         <w:t xml:space="preserve"> </w:t>
@@ -11767,7 +11767,7 @@
         <w:t xml:space="preserve"> </w:t>
       </w:r>
       <w:r>
-        <w:t xml:space="preserve">(ae-fdl-28-2023 · ae-fdl-38-2024 · ae-ede-register · ae-dha-cir-peptides-2026 · ae-doh-cir-148-2026 · ae-doh-compounding-std-2026)</w:t>
+        <w:t xml:space="preserve">(UAE federal legislation (President of the UAE) 2023 · UAE federal legislation (President of the UAE) 2024 · Emirates Drug Establishment (EDE) 2026 · Dubai Health Authority (DHA) 2026 · Department of Health – Abu Dhabi (DoH) 2026 · Department of Health – Abu Dhabi (DoH) 2026)</w:t>
       </w:r>
     </w:p>
     <w:p>
@@ -12011,7 +12011,7 @@
         <w:t xml:space="preserve"> </w:t>
       </w:r>
       <w:r>
-        <w:t xml:space="preserve">(eu-ema-epar-olumiant · eu-ema-ref-jaki-2023)</w:t>
+        <w:t xml:space="preserve">(European Medicines Agency 2017 · European Medicines Agency 2023)</w:t>
       </w:r>
       <w:r>
         <w:t xml:space="preserve"> </w:t>
@@ -12039,7 +12039,7 @@
         <w:t xml:space="preserve"> </w:t>
       </w:r>
       <w:r>
-        <w:t xml:space="preserve">(pt-infomed · pt-dl176-2006)</w:t>
+        <w:t xml:space="preserve">(INFARMED 2026 · Ministério da Saúde (Portugal) 2006)</w:t>
       </w:r>
       <w:r>
         <w:t xml:space="preserve"> </w:t>
@@ -12067,7 +12067,7 @@
         <w:t xml:space="preserve"> </w:t>
       </w:r>
       <w:r>
-        <w:t xml:space="preserve">(br-label-olumiant · br-anvisa-register-opendata)</w:t>
+        <w:t xml:space="preserve">(Eli Lilly do Brasil Ltda (Anvisa-approved package leaflet) 2026 · Agência Nacional de Vigilância Sanitária (Anvisa) 2026)</w:t>
       </w:r>
       <w:r>
         <w:t xml:space="preserve"> </w:t>
@@ -12095,7 +12095,7 @@
         <w:t xml:space="preserve"> </w:t>
       </w:r>
       <w:r>
-        <w:t xml:space="preserve">(ae-fdl-28-2023 · ae-fdl-38-2024 · ae-ede-reg-olumiant)</w:t>
+        <w:t xml:space="preserve">(UAE federal legislation (President of the UAE) 2023 · UAE federal legislation (President of the UAE) 2024 · Emirates Drug Establishment (EDE) 2026)</w:t>
       </w:r>
     </w:p>
     <w:p>
@@ -12333,7 +12333,7 @@
         <w:t xml:space="preserve"> </w:t>
       </w:r>
       <w:r>
-        <w:t xml:space="preserve">(eu-ema-psusa-minoxidil-2024 · eu-union-register · eu-ema-medicines-data · eu-ema-ref-finasteride-2025 · eu-ema-epar-olumiant)</w:t>
+        <w:t xml:space="preserve">(European Medicines Agency / CMDh 2024 · European Commission 2026 · European Medicines Agency 2026 · European Medicines Agency 2025 · European Medicines Agency 2017)</w:t>
       </w:r>
       <w:r>
         <w:t xml:space="preserve"> </w:t>
@@ -12361,7 +12361,7 @@
         <w:t xml:space="preserve"> </w:t>
       </w:r>
       <w:r>
-        <w:t xml:space="preserve">(pt-infomed · pt-rcm-minox5 · pt-dl176-2006)</w:t>
+        <w:t xml:space="preserve">(INFARMED 2026 · Laboratório Edol / INFARMED 2026 · Ministério da Saúde (Portugal) 2006)</w:t>
       </w:r>
       <w:r>
         <w:t xml:space="preserve"> </w:t>
@@ -12389,7 +12389,7 @@
         <w:t xml:space="preserve"> </w:t>
       </w:r>
       <w:r>
-        <w:t xml:space="preserve">(br-label-aloxidil · br-anvisa-register-opendata · br-label-prohair · br-label-olumiant)</w:t>
+        <w:t xml:space="preserve">(Theraskin Farmacêutica Ltda (Anvisa-approved package leaflet) 2025 · Agência Nacional de Vigilância Sanitária (Anvisa) 2026 · União Química Farmacêutica Nacional S/A (Anvisa-approved package leaflet) 2021 · Eli Lilly do Brasil Ltda (Anvisa-approved package leaflet) 2026)</w:t>
       </w:r>
       <w:r>
         <w:t xml:space="preserve"> </w:t>
@@ -12417,7 +12417,7 @@
         <w:t xml:space="preserve"> </w:t>
       </w:r>
       <w:r>
-        <w:t xml:space="preserve">(ae-fdl-28-2023 · ae-fdl-38-2024 · ae-ede-reg-regaine · ae-ede-register · ae-ede-reg-propecia · ae-ede-reg-fincrezo · ae-ede-reg-olumiant)</w:t>
+        <w:t xml:space="preserve">(UAE federal legislation (President of the UAE) 2023 · UAE federal legislation (President of the UAE) 2024 · Emirates Drug Establishment (EDE) 2026 · Emirates Drug Establishment (EDE) 2026 · Emirates Drug Establishment (EDE) 2026 · Emirates Drug Establishment (EDE) 2026 · Emirates Drug Establishment (EDE) 2026)</w:t>
       </w:r>
     </w:p>
     <w:p>
@@ -12728,7 +12728,7 @@
         <w:t xml:space="preserve"> </w:t>
       </w:r>
       <w:r>
-        <w:t xml:space="preserve">(eu-ema-epar-scenesse · eu-union-register)</w:t>
+        <w:t xml:space="preserve">(European Medicines Agency 2014 · European Commission 2026)</w:t>
       </w:r>
       <w:r>
         <w:t xml:space="preserve"> </w:t>
@@ -12756,7 +12756,7 @@
         <w:t xml:space="preserve"> </w:t>
       </w:r>
       <w:r>
-        <w:t xml:space="preserve">(pt-infomed · pt-dl176-2006)</w:t>
+        <w:t xml:space="preserve">(INFARMED 2026 · Ministério da Saúde (Portugal) 2006)</w:t>
       </w:r>
       <w:r>
         <w:t xml:space="preserve"> </w:t>
@@ -12784,7 +12784,7 @@
         <w:t xml:space="preserve"> </w:t>
       </w:r>
       <w:r>
-        <w:t xml:space="preserve">(br-anvisa-register-opendata · br-anvisa-register-dictionary · br-anvisa-consultas-medicamentos)</w:t>
+        <w:t xml:space="preserve">(Agência Nacional de Vigilância Sanitária (Anvisa) 2026 · Agência Nacional de Vigilância Sanitária (Anvisa) 2026 · Agência Nacional de Vigilância Sanitária (Anvisa) 2026)</w:t>
       </w:r>
       <w:r>
         <w:t xml:space="preserve"> </w:t>
@@ -12812,7 +12812,7 @@
         <w:t xml:space="preserve"> </w:t>
       </w:r>
       <w:r>
-        <w:t xml:space="preserve">(ae-fdl-28-2023 · ae-fdl-38-2024 · ae-ede-register)</w:t>
+        <w:t xml:space="preserve">(UAE federal legislation (President of the UAE) 2023 · UAE federal legislation (President of the UAE) 2024 · Emirates Drug Establishment (EDE) 2026)</w:t>
       </w:r>
     </w:p>
     <w:p>
@@ -13044,7 +13044,7 @@
         <w:t xml:space="preserve"> </w:t>
       </w:r>
       <w:r>
-        <w:t xml:space="preserve">(eu-ema-medicines-data · eu-union-register)</w:t>
+        <w:t xml:space="preserve">(European Medicines Agency 2026 · European Commission 2026)</w:t>
       </w:r>
       <w:r>
         <w:t xml:space="preserve"> </w:t>
@@ -13072,7 +13072,7 @@
         <w:t xml:space="preserve"> </w:t>
       </w:r>
       <w:r>
-        <w:t xml:space="preserve">(pt-infomed)</w:t>
+        <w:t xml:space="preserve">(INFARMED 2026)</w:t>
       </w:r>
       <w:r>
         <w:t xml:space="preserve"> </w:t>
@@ -13100,7 +13100,7 @@
         <w:t xml:space="preserve"> </w:t>
       </w:r>
       <w:r>
-        <w:t xml:space="preserve">(br-anvisa-register-opendata · br-anvisa-register-dictionary · br-anvisa-consultas-medicamentos · br-lei-6360-1976)</w:t>
+        <w:t xml:space="preserve">(Agência Nacional de Vigilância Sanitária (Anvisa) 2026 · Agência Nacional de Vigilância Sanitária (Anvisa) 2026 · Agência Nacional de Vigilância Sanitária (Anvisa) 2026 · Presidência da República 1976)</w:t>
       </w:r>
       <w:r>
         <w:t xml:space="preserve"> </w:t>
@@ -13128,7 +13128,7 @@
         <w:t xml:space="preserve"> </w:t>
       </w:r>
       <w:r>
-        <w:t xml:space="preserve">(ae-fdl-28-2023 · ae-fdl-38-2024 · ae-doh-cir-112-2025 · ae-ede-register · ae-dha-cir-melanotan-2025)</w:t>
+        <w:t xml:space="preserve">(UAE federal legislation (President of the UAE) 2023 · UAE federal legislation (President of the UAE) 2024 · Department of Health – Abu Dhabi (DoH) 2025 · Emirates Drug Establishment (EDE) 2026 · Dubai Health Authority (DHA) 2025)</w:t>
       </w:r>
     </w:p>
     <w:p>
@@ -13366,7 +13366,7 @@
         <w:t xml:space="preserve"> </w:t>
       </w:r>
       <w:r>
-        <w:t xml:space="preserve">(eu-dir-2001-83 · eu-ema-medicines-data · eu-union-register)</w:t>
+        <w:t xml:space="preserve">(European Parliament and Council of the European Union 2001 · European Medicines Agency 2026 · European Commission 2026)</w:t>
       </w:r>
       <w:r>
         <w:t xml:space="preserve"> </w:t>
@@ -13394,7 +13394,7 @@
         <w:t xml:space="preserve"> </w:t>
       </w:r>
       <w:r>
-        <w:t xml:space="preserve">(pt-dl95-2004 · pt-infarmed-manipulados · pt-infomed)</w:t>
+        <w:t xml:space="preserve">(Ministério da Saúde (Portugal); compiled by INFARMED 2004 · INFARMED 2026 · INFARMED 2026)</w:t>
       </w:r>
       <w:r>
         <w:t xml:space="preserve"> </w:t>
@@ -13422,7 +13422,7 @@
         <w:t xml:space="preserve"> </w:t>
       </w:r>
       <w:r>
-        <w:t xml:space="preserve">(br-anvisa-peptides-2026 · br-anvisa-register-opendata · br-anvisa-register-dictionary)</w:t>
+        <w:t xml:space="preserve">(Agência Nacional de Vigilância Sanitária (Anvisa) 2026 · Agência Nacional de Vigilância Sanitária (Anvisa) 2026 · Agência Nacional de Vigilância Sanitária (Anvisa) 2026)</w:t>
       </w:r>
       <w:r>
         <w:t xml:space="preserve"> </w:t>
@@ -13450,7 +13450,7 @@
         <w:t xml:space="preserve"> </w:t>
       </w:r>
       <w:r>
-        <w:t xml:space="preserve">(ae-fdl-28-2023 · ae-fdl-38-2024 · ae-ede-register · ae-dha-cir-peptides-2026 · ae-doh-cir-148-2026 · ae-doh-compounding-std-2026)</w:t>
+        <w:t xml:space="preserve">(UAE federal legislation (President of the UAE) 2023 · UAE federal legislation (President of the UAE) 2024 · Emirates Drug Establishment (EDE) 2026 · Dubai Health Authority (DHA) 2026 · Department of Health – Abu Dhabi (DoH) 2026 · Department of Health – Abu Dhabi (DoH) 2026)</w:t>
       </w:r>
     </w:p>
     <w:p>
@@ -13732,7 +13732,7 @@
         <w:t xml:space="preserve"> </w:t>
       </w:r>
       <w:r>
-        <w:t xml:space="preserve">(eu-ema-ref-somatropin-2012 · eu-ema-epar-omnitrope)</w:t>
+        <w:t xml:space="preserve">(European Medicines Agency 2012 · European Medicines Agency 2006)</w:t>
       </w:r>
       <w:r>
         <w:t xml:space="preserve"> </w:t>
@@ -13760,7 +13760,7 @@
         <w:t xml:space="preserve"> </w:t>
       </w:r>
       <w:r>
-        <w:t xml:space="preserve">(pt-infomed · pt-dl176-2006 · pt-infarmed-cnnhc · pt-portaria117-2019)</w:t>
+        <w:t xml:space="preserve">(INFARMED 2026 · Ministério da Saúde (Portugal) 2006 · INFARMED 2026 · Ministério da Saúde (Portugal) 2019)</w:t>
       </w:r>
       <w:r>
         <w:t xml:space="preserve"> </w:t>
@@ -13788,7 +13788,7 @@
         <w:t xml:space="preserve"> </w:t>
       </w:r>
       <w:r>
-        <w:t xml:space="preserve">(br-label-genotropin · br-anvisa-register-opendata · br-rdc-1036-2026 · br-anvisa-controlled-lists-page · br-cfm-1999-2012 · br-cfm-norms-search)</w:t>
+        <w:t xml:space="preserve">(Pfizer Brasil Ltda (Anvisa-approved package leaflet) 2025 · Agência Nacional de Vigilância Sanitária (Anvisa) 2026 · Anvisa – Diretoria Colegiada 2026 · Agência Nacional de Vigilância Sanitária (Anvisa) 2026 · Conselho Federal de Medicina 2012 · Conselho Federal de Medicina 2026)</w:t>
       </w:r>
       <w:r>
         <w:t xml:space="preserve"> </w:t>
@@ -13816,7 +13816,7 @@
         <w:t xml:space="preserve"> </w:t>
       </w:r>
       <w:r>
-        <w:t xml:space="preserve">(ae-fdl-28-2023 · ae-fdl-38-2024 · ae-ede-reg-genotropin · ae-ede-register · ae-mohap-md-306-2023)</w:t>
+        <w:t xml:space="preserve">(UAE federal legislation (President of the UAE) 2023 · UAE federal legislation (President of the UAE) 2024 · Emirates Drug Establishment (EDE) 2026 · Emirates Drug Establishment (EDE) 2026 · Minister of Health and Prevention (MOHAP) 2023)</w:t>
       </w:r>
     </w:p>
     <w:p>
@@ -14162,7 +14162,7 @@
         <w:t xml:space="preserve"> </w:t>
       </w:r>
       <w:r>
-        <w:t xml:space="preserve">(eu-ema-egrifta-withdrawal · eu-union-register)</w:t>
+        <w:t xml:space="preserve">(European Medicines Agency 2012 · European Commission 2026)</w:t>
       </w:r>
       <w:r>
         <w:t xml:space="preserve"> </w:t>
@@ -14190,7 +14190,7 @@
         <w:t xml:space="preserve"> </w:t>
       </w:r>
       <w:r>
-        <w:t xml:space="preserve">(br-anvisa-register-opendata · br-anvisa-register-dictionary · br-anvisa-consultas-medicamentos)</w:t>
+        <w:t xml:space="preserve">(Agência Nacional de Vigilância Sanitária (Anvisa) 2026 · Agência Nacional de Vigilância Sanitária (Anvisa) 2026 · Agência Nacional de Vigilância Sanitária (Anvisa) 2026)</w:t>
       </w:r>
       <w:r>
         <w:t xml:space="preserve"> </w:t>
@@ -14218,7 +14218,7 @@
         <w:t xml:space="preserve"> </w:t>
       </w:r>
       <w:r>
-        <w:t xml:space="preserve">(ae-fdl-28-2023 · ae-fdl-38-2024 · ae-ede-register · ae-dha-cir-peptides-2026 · ae-doh-cir-148-2026)</w:t>
+        <w:t xml:space="preserve">(UAE federal legislation (President of the UAE) 2023 · UAE federal legislation (President of the UAE) 2024 · Emirates Drug Establishment (EDE) 2026 · Dubai Health Authority (DHA) 2026 · Department of Health – Abu Dhabi (DoH) 2026)</w:t>
       </w:r>
     </w:p>
     <w:p>
@@ -14456,7 +14456,7 @@
         <w:t xml:space="preserve"> </w:t>
       </w:r>
       <w:r>
-        <w:t xml:space="preserve">(eu-ema-egrifta-withdrawal · eu-union-register · eu-ema-medicines-data · eu-dir-2001-83)</w:t>
+        <w:t xml:space="preserve">(European Medicines Agency 2012 · European Commission 2026 · European Medicines Agency 2026 · European Parliament and Council of the European Union 2001)</w:t>
       </w:r>
       <w:r>
         <w:t xml:space="preserve"> </w:t>
@@ -14484,7 +14484,7 @@
         <w:t xml:space="preserve"> </w:t>
       </w:r>
       <w:r>
-        <w:t xml:space="preserve">(pt-infomed · pt-dl176-2006 · pt-infarmed-aue)</w:t>
+        <w:t xml:space="preserve">(INFARMED 2026 · Ministério da Saúde (Portugal) 2006 · INFARMED 2026)</w:t>
       </w:r>
       <w:r>
         <w:t xml:space="preserve"> </w:t>
@@ -14512,7 +14512,7 @@
         <w:t xml:space="preserve"> </w:t>
       </w:r>
       <w:r>
-        <w:t xml:space="preserve">(br-anvisa-register-opendata · br-anvisa-register-dictionary · br-anvisa-consultas-medicamentos · br-anvisa-peptides-2026)</w:t>
+        <w:t xml:space="preserve">(Agência Nacional de Vigilância Sanitária (Anvisa) 2026 · Agência Nacional de Vigilância Sanitária (Anvisa) 2026 · Agência Nacional de Vigilância Sanitária (Anvisa) 2026 · Agência Nacional de Vigilância Sanitária (Anvisa) 2026)</w:t>
       </w:r>
       <w:r>
         <w:t xml:space="preserve"> </w:t>
@@ -14540,7 +14540,7 @@
         <w:t xml:space="preserve"> </w:t>
       </w:r>
       <w:r>
-        <w:t xml:space="preserve">(ae-fdl-28-2023 · ae-fdl-38-2024 · ae-ede-register · ae-dha-cir-peptides-2026 · ae-doh-cir-148-2026)</w:t>
+        <w:t xml:space="preserve">(UAE federal legislation (President of the UAE) 2023 · UAE federal legislation (President of the UAE) 2024 · Emirates Drug Establishment (EDE) 2026 · Dubai Health Authority (DHA) 2026 · Department of Health – Abu Dhabi (DoH) 2026)</w:t>
       </w:r>
     </w:p>
     <w:p>
@@ -14998,7 +14998,7 @@
         <w:t xml:space="preserve"> </w:t>
       </w:r>
       <w:r>
-        <w:t xml:space="preserve">(eu-ema-ref-somatropin-2012 · eu-ema-epar-omnitrope)</w:t>
+        <w:t xml:space="preserve">(European Medicines Agency 2012 · European Medicines Agency 2006)</w:t>
       </w:r>
       <w:r>
         <w:t xml:space="preserve"> </w:t>
@@ -15026,7 +15026,7 @@
         <w:t xml:space="preserve"> </w:t>
       </w:r>
       <w:r>
-        <w:t xml:space="preserve">(pt-infomed · pt-dl176-2006 · pt-infarmed-cnnhc · pt-portaria117-2019)</w:t>
+        <w:t xml:space="preserve">(INFARMED 2026 · Ministério da Saúde (Portugal) 2006 · INFARMED 2026 · Ministério da Saúde (Portugal) 2019)</w:t>
       </w:r>
       <w:r>
         <w:t xml:space="preserve"> </w:t>
@@ -15054,7 +15054,7 @@
         <w:t xml:space="preserve"> </w:t>
       </w:r>
       <w:r>
-        <w:t xml:space="preserve">(br-label-genotropin · br-anvisa-register-opendata · br-rdc-1036-2026 · br-anvisa-controlled-lists-page · br-cfm-1999-2012 · br-cfm-norms-search)</w:t>
+        <w:t xml:space="preserve">(Pfizer Brasil Ltda (Anvisa-approved package leaflet) 2025 · Agência Nacional de Vigilância Sanitária (Anvisa) 2026 · Anvisa – Diretoria Colegiada 2026 · Agência Nacional de Vigilância Sanitária (Anvisa) 2026 · Conselho Federal de Medicina 2012 · Conselho Federal de Medicina 2026)</w:t>
       </w:r>
       <w:r>
         <w:t xml:space="preserve"> </w:t>
@@ -15082,7 +15082,7 @@
         <w:t xml:space="preserve"> </w:t>
       </w:r>
       <w:r>
-        <w:t xml:space="preserve">(ae-fdl-28-2023 · ae-fdl-38-2024 · ae-ede-reg-genotropin · ae-ede-register · ae-mohap-md-306-2023)</w:t>
+        <w:t xml:space="preserve">(UAE federal legislation (President of the UAE) 2023 · UAE federal legislation (President of the UAE) 2024 · Emirates Drug Establishment (EDE) 2026 · Emirates Drug Establishment (EDE) 2026 · Minister of Health and Prevention (MOHAP) 2023)</w:t>
       </w:r>
     </w:p>
     <w:p>
@@ -15428,7 +15428,7 @@
         <w:t xml:space="preserve"> </w:t>
       </w:r>
       <w:r>
-        <w:t xml:space="preserve">(eu-ema-egrifta-withdrawal · eu-union-register)</w:t>
+        <w:t xml:space="preserve">(European Medicines Agency 2012 · European Commission 2026)</w:t>
       </w:r>
       <w:r>
         <w:t xml:space="preserve"> </w:t>
@@ -15456,7 +15456,7 @@
         <w:t xml:space="preserve"> </w:t>
       </w:r>
       <w:r>
-        <w:t xml:space="preserve">(br-anvisa-register-opendata · br-anvisa-register-dictionary · br-anvisa-consultas-medicamentos)</w:t>
+        <w:t xml:space="preserve">(Agência Nacional de Vigilância Sanitária (Anvisa) 2026 · Agência Nacional de Vigilância Sanitária (Anvisa) 2026 · Agência Nacional de Vigilância Sanitária (Anvisa) 2026)</w:t>
       </w:r>
       <w:r>
         <w:t xml:space="preserve"> </w:t>
@@ -15484,7 +15484,7 @@
         <w:t xml:space="preserve"> </w:t>
       </w:r>
       <w:r>
-        <w:t xml:space="preserve">(ae-fdl-28-2023 · ae-fdl-38-2024 · ae-ede-register · ae-dha-cir-peptides-2026 · ae-doh-cir-148-2026)</w:t>
+        <w:t xml:space="preserve">(UAE federal legislation (President of the UAE) 2023 · UAE federal legislation (President of the UAE) 2024 · Emirates Drug Establishment (EDE) 2026 · Dubai Health Authority (DHA) 2026 · Department of Health – Abu Dhabi (DoH) 2026)</w:t>
       </w:r>
     </w:p>
     <w:p>
@@ -15821,7 +15821,7 @@
         <w:t xml:space="preserve"> </w:t>
       </w:r>
       <w:r>
-        <w:t xml:space="preserve">(eu-ema-ref-somatropin-2012 · eu-ema-egrifta-withdrawal · eu-union-register · eu-ema-medicines-data · eu-ema-od-ibutamoren-2017)</w:t>
+        <w:t xml:space="preserve">(European Medicines Agency 2012 · European Medicines Agency 2012 · European Commission 2026 · European Medicines Agency 2026 · European Medicines Agency 2017)</w:t>
       </w:r>
       <w:r>
         <w:t xml:space="preserve"> </w:t>
@@ -15849,7 +15849,7 @@
         <w:t xml:space="preserve"> </w:t>
       </w:r>
       <w:r>
-        <w:t xml:space="preserve">(pt-infomed · pt-dl95-2004 · pt-infarmed-manipulados)</w:t>
+        <w:t xml:space="preserve">(INFARMED 2026 · Ministério da Saúde (Portugal); compiled by INFARMED 2004 · INFARMED 2026)</w:t>
       </w:r>
       <w:r>
         <w:t xml:space="preserve"> </w:t>
@@ -15877,7 +15877,7 @@
         <w:t xml:space="preserve"> </w:t>
       </w:r>
       <w:r>
-        <w:t xml:space="preserve">(br-anvisa-register-opendata · br-anvisa-register-dictionary · br-anvisa-consultas-medicamentos · br-anvisa-peptides-2026 · br-dou-re-2318-2026)</w:t>
+        <w:t xml:space="preserve">(Agência Nacional de Vigilância Sanitária (Anvisa) 2026 · Agência Nacional de Vigilância Sanitária (Anvisa) 2026 · Agência Nacional de Vigilância Sanitária (Anvisa) 2026 · Agência Nacional de Vigilância Sanitária (Anvisa) 2026 · Anvisa – Coordenação de Pesquisa Clínica em Medicamentos e Produtos Biológicos 2026)</w:t>
       </w:r>
       <w:r>
         <w:t xml:space="preserve"> </w:t>
@@ -15905,7 +15905,7 @@
         <w:t xml:space="preserve"> </w:t>
       </w:r>
       <w:r>
-        <w:t xml:space="preserve">(ae-fdl-28-2023 · ae-fdl-38-2024 · ae-ede-reg-genotropin · ae-ede-register · ae-dha-cir-peptides-2026 · ae-doh-compounding-std-2026)</w:t>
+        <w:t xml:space="preserve">(UAE federal legislation (President of the UAE) 2023 · UAE federal legislation (President of the UAE) 2024 · Emirates Drug Establishment (EDE) 2026 · Emirates Drug Establishment (EDE) 2026 · Dubai Health Authority (DHA) 2026 · Department of Health – Abu Dhabi (DoH) 2026)</w:t>
       </w:r>
     </w:p>
     <w:p>
@@ -16143,7 +16143,7 @@
         <w:t xml:space="preserve"> </w:t>
       </w:r>
       <w:r>
-        <w:t xml:space="preserve">(eu-ema-egrifta-withdrawal · eu-union-register · eu-ema-medicines-data · eu-dir-2001-83)</w:t>
+        <w:t xml:space="preserve">(European Medicines Agency 2012 · European Commission 2026 · European Medicines Agency 2026 · European Parliament and Council of the European Union 2001)</w:t>
       </w:r>
       <w:r>
         <w:t xml:space="preserve"> </w:t>
@@ -16171,7 +16171,7 @@
         <w:t xml:space="preserve"> </w:t>
       </w:r>
       <w:r>
-        <w:t xml:space="preserve">(pt-infomed · pt-dl176-2006 · pt-infarmed-aue)</w:t>
+        <w:t xml:space="preserve">(INFARMED 2026 · Ministério da Saúde (Portugal) 2006 · INFARMED 2026)</w:t>
       </w:r>
       <w:r>
         <w:t xml:space="preserve"> </w:t>
@@ -16199,7 +16199,7 @@
         <w:t xml:space="preserve"> </w:t>
       </w:r>
       <w:r>
-        <w:t xml:space="preserve">(br-anvisa-register-opendata · br-anvisa-register-dictionary · br-anvisa-consultas-medicamentos · br-anvisa-peptides-2026)</w:t>
+        <w:t xml:space="preserve">(Agência Nacional de Vigilância Sanitária (Anvisa) 2026 · Agência Nacional de Vigilância Sanitária (Anvisa) 2026 · Agência Nacional de Vigilância Sanitária (Anvisa) 2026 · Agência Nacional de Vigilância Sanitária (Anvisa) 2026)</w:t>
       </w:r>
       <w:r>
         <w:t xml:space="preserve"> </w:t>
@@ -16227,7 +16227,7 @@
         <w:t xml:space="preserve"> </w:t>
       </w:r>
       <w:r>
-        <w:t xml:space="preserve">(ae-fdl-28-2023 · ae-fdl-38-2024 · ae-ede-register · ae-dha-cir-peptides-2026 · ae-doh-cir-148-2026)</w:t>
+        <w:t xml:space="preserve">(UAE federal legislation (President of the UAE) 2023 · UAE federal legislation (President of the UAE) 2024 · Emirates Drug Establishment (EDE) 2026 · Dubai Health Authority (DHA) 2026 · Department of Health – Abu Dhabi (DoH) 2026)</w:t>
       </w:r>
     </w:p>
     <w:p>
@@ -16531,7 +16531,7 @@
         <w:t xml:space="preserve"> </w:t>
       </w:r>
       <w:r>
-        <w:t xml:space="preserve">(eu-dir-2001-83)</w:t>
+        <w:t xml:space="preserve">(European Parliament and Council of the European Union 2001)</w:t>
       </w:r>
       <w:r>
         <w:t xml:space="preserve"> </w:t>
@@ -16559,7 +16559,7 @@
         <w:t xml:space="preserve"> </w:t>
       </w:r>
       <w:r>
-        <w:t xml:space="preserve">(pt-infarmed-circ148-2011 · pt-dl176-2006 · pt-infarmed-aue · pt-dl95-2004 · pt-infarmed-manipulados)</w:t>
+        <w:t xml:space="preserve">(INFARMED 2011 · Ministério da Saúde (Portugal) 2006 · INFARMED 2026 · Ministério da Saúde (Portugal); compiled by INFARMED 2004 · INFARMED 2026)</w:t>
       </w:r>
       <w:r>
         <w:t xml:space="preserve"> </w:t>
@@ -16587,7 +16587,7 @@
         <w:t xml:space="preserve"> </w:t>
       </w:r>
       <w:r>
-        <w:t xml:space="preserve">(br-anvisa-import-pens-2025 · br-anvisa-import-guidance-2025 · br-anvisa-implants-2024)</w:t>
+        <w:t xml:space="preserve">(Agência Nacional de Vigilância Sanitária (Anvisa) 2025 · Agência Nacional de Vigilância Sanitária (Anvisa) 2025 · Agência Nacional de Vigilância Sanitária (Anvisa) 2024)</w:t>
       </w:r>
       <w:r>
         <w:t xml:space="preserve"> </w:t>
@@ -16615,15 +16615,15 @@
         <w:t xml:space="preserve"> </w:t>
       </w:r>
       <w:r>
-        <w:t xml:space="preserve">(ae-fdl-28-2023 · ae-fdl-38-2024 · ae-doh-compounding-std-2026 · ae-dha-cir-peptides-2026)</w:t>
-      </w:r>
-    </w:p>
-    <w:p>
-      <w:pPr>
-        <w:pStyle w:val="BodyText"/>
-      </w:pPr>
-      <w:r>
-        <w:t xml:space="preserve">Sources: Human Medicines Regulations 2012 (UK) 2012 · Human Medicines Regulations 2012 (UK) 2012 · Medicines Act 1968 (UK) 1968 · Medicines and Healthcare products Regulatory Agency (UK) 2023 · Medicines and Healthcare products Regulatory Agency (UK) 2009 · General Medical Council (UK) 2021 · General Pharmaceutical Council (UK) 2025 · Nursing and Midwifery Council (UK) 2018 · United States Code (as codified) 2026 · US Food and Drug Administration 2026 · eu-dir-2001-83 · pt-dl95-2004 · pt-infarmed-circ148-2011 · br-rdc-96-2008 · br-anvisa-peptides-2026 · br-anvisa-import-pens-2025 · br-anvisa-import-guidance-2025 · ae-fdl-38-2024</w:t>
+        <w:t xml:space="preserve">(UAE federal legislation (President of the UAE) 2023 · UAE federal legislation (President of the UAE) 2024 · Department of Health – Abu Dhabi (DoH) 2026 · Dubai Health Authority (DHA) 2026)</w:t>
+      </w:r>
+    </w:p>
+    <w:p>
+      <w:pPr>
+        <w:pStyle w:val="BodyText"/>
+      </w:pPr>
+      <w:r>
+        <w:t xml:space="preserve">Sources: Human Medicines Regulations 2012 (UK) 2012 · Human Medicines Regulations 2012 (UK) 2012 · Medicines Act 1968 (UK) 1968 · Medicines and Healthcare products Regulatory Agency (UK) 2023 · Medicines and Healthcare products Regulatory Agency (UK) 2009 · General Medical Council (UK) 2021 · General Pharmaceutical Council (UK) 2025 · Nursing and Midwifery Council (UK) 2018 · United States Code (as codified) 2026 · US Food and Drug Administration 2026 · European Parliament and Council of the European Union 2001 · Ministério da Saúde (Portugal); compiled by INFARMED 2004 · INFARMED 2011 · Anvisa – Diretoria Colegiada 2008 · Agência Nacional de Vigilância Sanitária (Anvisa) 2026 · Agência Nacional de Vigilância Sanitária (Anvisa) 2025 · Agência Nacional de Vigilância Sanitária (Anvisa) 2025 · UAE federal legislation (President of the UAE) 2024</w:t>
       </w:r>
     </w:p>
     <w:p>
@@ -16775,7 +16775,7 @@
         <w:t xml:space="preserve"> </w:t>
       </w:r>
       <w:r>
-        <w:t xml:space="preserve">(eu-dir-2001-83 · eu-dir-2010-13)</w:t>
+        <w:t xml:space="preserve">(European Parliament and Council of the European Union 2001 · European Parliament and Council of the European Union 2010)</w:t>
       </w:r>
       <w:r>
         <w:t xml:space="preserve"> </w:t>
@@ -16803,7 +16803,7 @@
         <w:t xml:space="preserve"> </w:t>
       </w:r>
       <w:r>
-        <w:t xml:space="preserve">(pt-dl176-2006 · pt-dl238-2015)</w:t>
+        <w:t xml:space="preserve">(Ministério da Saúde (Portugal) 2006 · Ministério da Saúde (Portugal) 2015)</w:t>
       </w:r>
       <w:r>
         <w:t xml:space="preserve"> </w:t>
@@ -16831,7 +16831,7 @@
         <w:t xml:space="preserve"> </w:t>
       </w:r>
       <w:r>
-        <w:t xml:space="preserve">(br-rdc-96-2008 · br-anvisa-implants-2024 · br-cfm-2336-2023 · br-cfm-norms-search · br-anvisa-peptides-2026)</w:t>
+        <w:t xml:space="preserve">(Anvisa – Diretoria Colegiada 2008 · Agência Nacional de Vigilância Sanitária (Anvisa) 2024 · Conselho Federal de Medicina 2023 · Conselho Federal de Medicina 2026 · Agência Nacional de Vigilância Sanitária (Anvisa) 2026)</w:t>
       </w:r>
       <w:r>
         <w:t xml:space="preserve"> </w:t>
@@ -16859,7 +16859,7 @@
         <w:t xml:space="preserve"> </w:t>
       </w:r>
       <w:r>
-        <w:t xml:space="preserve">(ae-fdl-28-2023 · ae-fdl-38-2024 · ae-ede-svc-advert · ae-dha-cir-peptides-2026 · ae-doh-cir-148-2026 · ae-doh-compounding-std-2026)</w:t>
+        <w:t xml:space="preserve">(UAE federal legislation (President of the UAE) 2023 · UAE federal legislation (President of the UAE) 2024 · Emirates Drug Establishment (EDE) 2026 · Dubai Health Authority (DHA) 2026 · Department of Health – Abu Dhabi (DoH) 2026 · Department of Health – Abu Dhabi (DoH) 2026)</w:t>
       </w:r>
     </w:p>
     <w:p>
@@ -16883,7 +16883,7 @@
         <w:pStyle w:val="BodyText"/>
       </w:pPr>
       <w:r>
-        <w:t xml:space="preserve">Sources: Medicines and Healthcare products Regulatory Agency (UK) 2025 · Human Medicines Regulations 2012 (UK) 2012 · Human Medicines Regulations 2012 (UK) 2012 · Human Medicines Regulations 2012 (UK) 2012 · Committee of Advertising Practice / Advertising Standards Authority 2026 · Medicines and Healthcare products Regulatory Agency (UK) 2020 · Advertising Standards Authority 2026 · eu-dir-2001-83 · eu-dir-2010-13 · pt-dl176-2006 · pt-dl238-2015 · br-lei-6360-1976 · br-lei-9294-1996 · br-rdc-96-2008 · br-rdc-907-2024 · br-anvisa-peptides-2026 · br-cfm-2336-2023 · ae-fdl-38-2024 · ae-ede-svc-classification · ae-ede-svc-advert · ae-dha-cir-peptides-2026</w:t>
+        <w:t xml:space="preserve">Sources: Medicines and Healthcare products Regulatory Agency (UK) 2025 · Human Medicines Regulations 2012 (UK) 2012 · Human Medicines Regulations 2012 (UK) 2012 · Human Medicines Regulations 2012 (UK) 2012 · Committee of Advertising Practice / Advertising Standards Authority 2026 · Medicines and Healthcare products Regulatory Agency (UK) 2020 · Advertising Standards Authority 2026 · European Parliament and Council of the European Union 2001 · European Parliament and Council of the European Union 2010 · Ministério da Saúde (Portugal) 2006 · Ministério da Saúde (Portugal) 2015 · Presidência da República 1976 · Presidência da República 1996 · Anvisa – Diretoria Colegiada 2008 · Anvisa – Diretoria Colegiada 2024 · Agência Nacional de Vigilância Sanitária (Anvisa) 2026 · Conselho Federal de Medicina 2023 · UAE federal legislation (President of the UAE) 2024 · Emirates Drug Establishment (EDE) 2026 · Emirates Drug Establishment (EDE) 2026 · Dubai Health Authority (DHA) 2026</w:t>
       </w:r>
     </w:p>
     <w:p>
@@ -17307,7 +17307,7 @@
         <w:t xml:space="preserve"> </w:t>
       </w:r>
       <w:r>
-        <w:t xml:space="preserve">(eu-dir-2001-83 · eu-reg-1223-2009 · eu-dir-2002-46 · eu-reg-1924-2006)</w:t>
+        <w:t xml:space="preserve">(European Parliament and Council of the European Union 2001 · European Parliament and Council of the European Union 2009 · European Parliament and Council of the European Union 2002 · European Parliament and Council of the European Union 2006)</w:t>
       </w:r>
       <w:r>
         <w:t xml:space="preserve"> </w:t>
@@ -17335,7 +17335,7 @@
         <w:t xml:space="preserve"> </w:t>
       </w:r>
       <w:r>
-        <w:t xml:space="preserve">(pt-dl23-2025 · pt-infarmed-cosmetics-faq · pt-dgav-supplements · pt-dgav-notification)</w:t>
+        <w:t xml:space="preserve">(Presidência do Conselho de Ministros / Governo de Portugal 2025 · INFARMED 2026 · Direção-Geral de Alimentação e Veterinária (DGAV) 2026 · Direção-Geral de Alimentação e Veterinária (DGAV) 2026)</w:t>
       </w:r>
       <w:r>
         <w:t xml:space="preserve"> </w:t>
@@ -17363,7 +17363,7 @@
         <w:t xml:space="preserve"> </w:t>
       </w:r>
       <w:r>
-        <w:t xml:space="preserve">(br-rdc-907-2024 · br-anvisa-peptides-2026 · br-anvisa-cosmetics-opendata · br-dou-re-1771-2026 · br-rdc-243-2018 · br-anvisa-supplements-ingredients)</w:t>
+        <w:t xml:space="preserve">(Anvisa – Diretoria Colegiada 2024 · Agência Nacional de Vigilância Sanitária (Anvisa) 2026 · Agência Nacional de Vigilância Sanitária (Anvisa) 2026 · Anvisa – Gerência-Geral de Cosméticos e Saneantes 2026 · Anvisa – Diretoria Colegiada 2018 · Agência Nacional de Vigilância Sanitária (Anvisa) 2026)</w:t>
       </w:r>
       <w:r>
         <w:t xml:space="preserve"> </w:t>
@@ -17391,7 +17391,7 @@
         <w:t xml:space="preserve"> </w:t>
       </w:r>
       <w:r>
-        <w:t xml:space="preserve">(ae-fdl-28-2023 · ae-fdl-38-2024 · ae-moiat-regulated-products · ae-moiat-ecas-service · ae-ede-svc-classification · ae-doh-cir-148-2026)</w:t>
+        <w:t xml:space="preserve">(UAE federal legislation (President of the UAE) 2023 · UAE federal legislation (President of the UAE) 2024 · Ministry of Industry and Advanced Technology (MoIAT) 2022 · Ministry of Industry and Advanced Technology (MoIAT) 2026 · Emirates Drug Establishment (EDE) 2026 · Department of Health – Abu Dhabi (DoH) 2026)</w:t>
       </w:r>
     </w:p>
     <w:p>
@@ -17728,7 +17728,7 @@
         <w:t xml:space="preserve"> </w:t>
       </w:r>
       <w:r>
-        <w:t xml:space="preserve">(eu-dir-2001-83)</w:t>
+        <w:t xml:space="preserve">(European Parliament and Council of the European Union 2001)</w:t>
       </w:r>
       <w:r>
         <w:t xml:space="preserve"> </w:t>
@@ -17756,7 +17756,7 @@
         <w:t xml:space="preserve"> </w:t>
       </w:r>
       <w:r>
-        <w:t xml:space="preserve">(pt-dl95-2004 · pt-infarmed-manipulados · pt-delib840-2023 · pt-infarmed-aue)</w:t>
+        <w:t xml:space="preserve">(Ministério da Saúde (Portugal); compiled by INFARMED 2004 · INFARMED 2026 · INFARMED 2023 · INFARMED 2026)</w:t>
       </w:r>
       <w:r>
         <w:t xml:space="preserve"> </w:t>
@@ -17784,7 +17784,7 @@
         <w:t xml:space="preserve"> </w:t>
       </w:r>
       <w:r>
-        <w:t xml:space="preserve">(br-anvisa-import-guidance-2025 · br-anvisa-glp1-retention-2025)</w:t>
+        <w:t xml:space="preserve">(Agência Nacional de Vigilância Sanitária (Anvisa) 2025 · Agência Nacional de Vigilância Sanitária (Anvisa) 2025)</w:t>
       </w:r>
       <w:r>
         <w:t xml:space="preserve"> </w:t>
@@ -17812,7 +17812,7 @@
         <w:t xml:space="preserve"> </w:t>
       </w:r>
       <w:r>
-        <w:t xml:space="preserve">(ae-fdl-28-2023 · ae-fdl-38-2024 · ae-doh-cir-148-2026 · ae-dha-cir-peptides-2026)</w:t>
+        <w:t xml:space="preserve">(UAE federal legislation (President of the UAE) 2023 · UAE federal legislation (President of the UAE) 2024 · Department of Health – Abu Dhabi (DoH) 2026 · Dubai Health Authority (DHA) 2026)</w:t>
       </w:r>
     </w:p>
     <w:p>
@@ -18148,7 +18148,7 @@
         <w:t xml:space="preserve"> </w:t>
       </w:r>
       <w:r>
-        <w:t xml:space="preserve">(eu-dir-2001-83)</w:t>
+        <w:t xml:space="preserve">(European Parliament and Council of the European Union 2001)</w:t>
       </w:r>
       <w:r>
         <w:t xml:space="preserve"> </w:t>
@@ -18176,7 +18176,7 @@
         <w:t xml:space="preserve"> </w:t>
       </w:r>
       <w:r>
-        <w:t xml:space="preserve">(pt-dl95-2004 · pt-infarmed-manipulados)</w:t>
+        <w:t xml:space="preserve">(Ministério da Saúde (Portugal); compiled by INFARMED 2004 · INFARMED 2026)</w:t>
       </w:r>
       <w:r>
         <w:t xml:space="preserve"> </w:t>
@@ -18204,7 +18204,7 @@
         <w:t xml:space="preserve"> </w:t>
       </w:r>
       <w:r>
-        <w:t xml:space="preserve">(br-rdc-96-2008 · br-anvisa-voto-101-2026 · br-anvisa-peptides-2026)</w:t>
+        <w:t xml:space="preserve">(Anvisa – Diretoria Colegiada 2008 · Anvisa – Diretoria Colegiada (Quarta Diretoria) 2026 · Agência Nacional de Vigilância Sanitária (Anvisa) 2026)</w:t>
       </w:r>
       <w:r>
         <w:t xml:space="preserve"> </w:t>
@@ -18232,7 +18232,7 @@
         <w:t xml:space="preserve"> </w:t>
       </w:r>
       <w:r>
-        <w:t xml:space="preserve">(ae-fdl-28-2023 · ae-fdl-38-2024 · ae-doh-compounding-std-2026 · ae-dha-cir-peptides-2026)</w:t>
+        <w:t xml:space="preserve">(UAE federal legislation (President of the UAE) 2023 · UAE federal legislation (President of the UAE) 2024 · Department of Health – Abu Dhabi (DoH) 2026 · Dubai Health Authority (DHA) 2026)</w:t>
       </w:r>
     </w:p>
     <w:p>
@@ -18550,7 +18550,7 @@
         <w:t xml:space="preserve"> </w:t>
       </w:r>
       <w:r>
-        <w:t xml:space="preserve">(eu-ema-medicines-data · eu-union-register · eu-cosing-copper-tripeptide-1 · eu-cosing-home)</w:t>
+        <w:t xml:space="preserve">(European Medicines Agency 2026 · European Commission 2026 · European Commission 2026 · European Commission 2026)</w:t>
       </w:r>
       <w:r>
         <w:t xml:space="preserve"> </w:t>
@@ -18578,7 +18578,7 @@
         <w:t xml:space="preserve"> </w:t>
       </w:r>
       <w:r>
-        <w:t xml:space="preserve">(pt-infomed)</w:t>
+        <w:t xml:space="preserve">(INFARMED 2026)</w:t>
       </w:r>
       <w:r>
         <w:t xml:space="preserve"> </w:t>
@@ -18606,7 +18606,7 @@
         <w:t xml:space="preserve"> </w:t>
       </w:r>
       <w:r>
-        <w:t xml:space="preserve">(br-anvisa-peptides-2026 · br-anvisa-register-opendata · br-anvisa-register-dictionary · br-anvisa-consultas-medicamentos)</w:t>
+        <w:t xml:space="preserve">(Agência Nacional de Vigilância Sanitária (Anvisa) 2026 · Agência Nacional de Vigilância Sanitária (Anvisa) 2026 · Agência Nacional de Vigilância Sanitária (Anvisa) 2026 · Agência Nacional de Vigilância Sanitária (Anvisa) 2026)</w:t>
       </w:r>
       <w:r>
         <w:t xml:space="preserve"> </w:t>
@@ -18634,7 +18634,7 @@
         <w:t xml:space="preserve"> </w:t>
       </w:r>
       <w:r>
-        <w:t xml:space="preserve">(ae-fdl-28-2023 · ae-ede-register · ae-doh-cir-112-2025 · ae-dha-cir-peptides-2026 · ae-doh-cir-148-2026)</w:t>
+        <w:t xml:space="preserve">(UAE federal legislation (President of the UAE) 2023 · Emirates Drug Establishment (EDE) 2026 · Department of Health – Abu Dhabi (DoH) 2025 · Dubai Health Authority (DHA) 2026 · Department of Health – Abu Dhabi (DoH) 2026)</w:t>
       </w:r>
     </w:p>
     <w:p>
@@ -18780,7 +18780,7 @@
         <w:t xml:space="preserve"> </w:t>
       </w:r>
       <w:r>
-        <w:t xml:space="preserve">(eu-ema-egrifta-withdrawal · eu-union-register)</w:t>
+        <w:t xml:space="preserve">(European Medicines Agency 2012 · European Commission 2026)</w:t>
       </w:r>
       <w:r>
         <w:t xml:space="preserve"> </w:t>
@@ -18808,7 +18808,7 @@
         <w:t xml:space="preserve"> </w:t>
       </w:r>
       <w:r>
-        <w:t xml:space="preserve">(br-anvisa-register-opendata · br-anvisa-register-dictionary · br-anvisa-consultas-medicamentos)</w:t>
+        <w:t xml:space="preserve">(Agência Nacional de Vigilância Sanitária (Anvisa) 2026 · Agência Nacional de Vigilância Sanitária (Anvisa) 2026 · Agência Nacional de Vigilância Sanitária (Anvisa) 2026)</w:t>
       </w:r>
       <w:r>
         <w:t xml:space="preserve"> </w:t>
@@ -18836,15 +18836,15 @@
         <w:t xml:space="preserve"> </w:t>
       </w:r>
       <w:r>
-        <w:t xml:space="preserve">(ae-fdl-28-2023 · ae-ede-register)</w:t>
-      </w:r>
-    </w:p>
-    <w:p>
-      <w:pPr>
-        <w:pStyle w:val="BodyText"/>
-      </w:pPr>
-      <w:r>
-        <w:t xml:space="preserve">Sources: egrifta-wr-label-2026 · US Food and Drug Administration 2020 · US Food and Drug Administration 2020 · US Food and Drug Administration 2020 · The Peptide Pocket Guide — 2026 Edition · Clinical Reference (seventy-two entries) 2026 · US District Court 2025 · US Court of Appeals for the Seventh Circuit 2026</w:t>
+        <w:t xml:space="preserve">(UAE federal legislation (President of the UAE) 2023 · Emirates Drug Establishment (EDE) 2026)</w:t>
+      </w:r>
+    </w:p>
+    <w:p>
+      <w:pPr>
+        <w:pStyle w:val="BodyText"/>
+      </w:pPr>
+      <w:r>
+        <w:t xml:space="preserve">Sources: Theratechnologies Inc. (FDA-approved labeling) 2026 · US Food and Drug Administration 2020 · US Food and Drug Administration 2020 · US Food and Drug Administration 2020 · The Peptide Pocket Guide — 2026 Edition · Clinical Reference (seventy-two entries) 2026 · US District Court 2025 · US Court of Appeals for the Seventh Circuit 2026</w:t>
       </w:r>
     </w:p>
     <w:p>
@@ -19096,7 +19096,7 @@
         <w:t xml:space="preserve"> </w:t>
       </w:r>
       <w:r>
-        <w:t xml:space="preserve">(eu-dir-2001-83)</w:t>
+        <w:t xml:space="preserve">(European Parliament and Council of the European Union 2001)</w:t>
       </w:r>
       <w:r>
         <w:t xml:space="preserve"> </w:t>
@@ -19124,7 +19124,7 @@
         <w:t xml:space="preserve"> </w:t>
       </w:r>
       <w:r>
-        <w:t xml:space="preserve">(pt-infarmed-circ148-2011 · pt-dl176-2006 · pt-infarmed-aue · pt-dl95-2004 · pt-infarmed-manipulados)</w:t>
+        <w:t xml:space="preserve">(INFARMED 2011 · Ministério da Saúde (Portugal) 2006 · INFARMED 2026 · Ministério da Saúde (Portugal); compiled by INFARMED 2004 · INFARMED 2026)</w:t>
       </w:r>
       <w:r>
         <w:t xml:space="preserve"> </w:t>
@@ -19152,7 +19152,7 @@
         <w:t xml:space="preserve"> </w:t>
       </w:r>
       <w:r>
-        <w:t xml:space="preserve">(br-anvisa-import-pens-2025 · br-anvisa-import-guidance-2025 · br-anvisa-implants-2024)</w:t>
+        <w:t xml:space="preserve">(Agência Nacional de Vigilância Sanitária (Anvisa) 2025 · Agência Nacional de Vigilância Sanitária (Anvisa) 2025 · Agência Nacional de Vigilância Sanitária (Anvisa) 2024)</w:t>
       </w:r>
       <w:r>
         <w:t xml:space="preserve"> </w:t>
@@ -19180,15 +19180,15 @@
         <w:t xml:space="preserve"> </w:t>
       </w:r>
       <w:r>
-        <w:t xml:space="preserve">(ae-fdl-28-2023 · ae-fdl-38-2024 · ae-doh-compounding-std-2026 · ae-dha-cir-peptides-2026)</w:t>
-      </w:r>
-    </w:p>
-    <w:p>
-      <w:pPr>
-        <w:pStyle w:val="BodyText"/>
-      </w:pPr>
-      <w:r>
-        <w:t xml:space="preserve">Sources: Human Medicines Regulations 2012 (UK) 2012 · Human Medicines Regulations 2012 (UK) 2012 · Medicines Act 1968 (UK) 1968 · Medicines and Healthcare products Regulatory Agency (UK) 2023 · Medicines and Healthcare products Regulatory Agency (UK) 2009 · General Medical Council (UK) 2021 · General Pharmaceutical Council (UK) 2025 · Nursing and Midwifery Council (UK) 2018 · United States Code (as codified) 2026 · US Food and Drug Administration 2026 · eu-dir-2001-83 · pt-dl95-2004 · pt-infarmed-circ148-2011 · br-rdc-96-2008 · br-anvisa-peptides-2026 · br-anvisa-import-pens-2025 · br-anvisa-import-guidance-2025 · ae-fdl-38-2024</w:t>
+        <w:t xml:space="preserve">(UAE federal legislation (President of the UAE) 2023 · UAE federal legislation (President of the UAE) 2024 · Department of Health – Abu Dhabi (DoH) 2026 · Dubai Health Authority (DHA) 2026)</w:t>
+      </w:r>
+    </w:p>
+    <w:p>
+      <w:pPr>
+        <w:pStyle w:val="BodyText"/>
+      </w:pPr>
+      <w:r>
+        <w:t xml:space="preserve">Sources: Human Medicines Regulations 2012 (UK) 2012 · Human Medicines Regulations 2012 (UK) 2012 · Medicines Act 1968 (UK) 1968 · Medicines and Healthcare products Regulatory Agency (UK) 2023 · Medicines and Healthcare products Regulatory Agency (UK) 2009 · General Medical Council (UK) 2021 · General Pharmaceutical Council (UK) 2025 · Nursing and Midwifery Council (UK) 2018 · United States Code (as codified) 2026 · US Food and Drug Administration 2026 · European Parliament and Council of the European Union 2001 · Ministério da Saúde (Portugal); compiled by INFARMED 2004 · INFARMED 2011 · Anvisa – Diretoria Colegiada 2008 · Agência Nacional de Vigilância Sanitária (Anvisa) 2026 · Agência Nacional de Vigilância Sanitária (Anvisa) 2025 · Agência Nacional de Vigilância Sanitária (Anvisa) 2025 · UAE federal legislation (President of the UAE) 2024</w:t>
       </w:r>
     </w:p>
     <w:p>
@@ -19390,7 +19390,7 @@
         <w:t xml:space="preserve"> </w:t>
       </w:r>
       <w:r>
-        <w:t xml:space="preserve">(eu-dir-2001-83)</w:t>
+        <w:t xml:space="preserve">(European Parliament and Council of the European Union 2001)</w:t>
       </w:r>
       <w:r>
         <w:t xml:space="preserve"> </w:t>
@@ -19418,7 +19418,7 @@
         <w:t xml:space="preserve"> </w:t>
       </w:r>
       <w:r>
-        <w:t xml:space="preserve">(pt-dl176-2006)</w:t>
+        <w:t xml:space="preserve">(Ministério da Saúde (Portugal) 2006)</w:t>
       </w:r>
       <w:r>
         <w:t xml:space="preserve"> </w:t>
@@ -19446,7 +19446,7 @@
         <w:t xml:space="preserve"> </w:t>
       </w:r>
       <w:r>
-        <w:t xml:space="preserve">(br-anvisa-peptides-2026 · br-anvisa-medicine-types-2026)</w:t>
+        <w:t xml:space="preserve">(Agência Nacional de Vigilância Sanitária (Anvisa) 2026 · Agência Nacional de Vigilância Sanitária (Anvisa) 2026)</w:t>
       </w:r>
       <w:r>
         <w:t xml:space="preserve"> </w:t>
@@ -19474,7 +19474,7 @@
         <w:t xml:space="preserve"> </w:t>
       </w:r>
       <w:r>
-        <w:t xml:space="preserve">(ae-fdl-28-2023 · ae-fdl-38-2024 · ae-dha-cir-peptides-2026 · ae-doh-compounding-std-2026)</w:t>
+        <w:t xml:space="preserve">(UAE federal legislation (President of the UAE) 2023 · UAE federal legislation (President of the UAE) 2024 · Dubai Health Authority (DHA) 2026 · Department of Health – Abu Dhabi (DoH) 2026)</w:t>
       </w:r>
     </w:p>
     <w:p>
@@ -19650,7 +19650,7 @@
         <w:t xml:space="preserve"> </w:t>
       </w:r>
       <w:r>
-        <w:t xml:space="preserve">(eu-dir-2001-83 · eu-dir-2010-13)</w:t>
+        <w:t xml:space="preserve">(European Parliament and Council of the European Union 2001 · European Parliament and Council of the European Union 2010)</w:t>
       </w:r>
       <w:r>
         <w:t xml:space="preserve"> </w:t>
@@ -19678,7 +19678,7 @@
         <w:t xml:space="preserve"> </w:t>
       </w:r>
       <w:r>
-        <w:t xml:space="preserve">(pt-dl176-2006 · pt-dl238-2015)</w:t>
+        <w:t xml:space="preserve">(Ministério da Saúde (Portugal) 2006 · Ministério da Saúde (Portugal) 2015)</w:t>
       </w:r>
       <w:r>
         <w:t xml:space="preserve"> </w:t>
@@ -19706,7 +19706,7 @@
         <w:t xml:space="preserve"> </w:t>
       </w:r>
       <w:r>
-        <w:t xml:space="preserve">(br-rdc-96-2008 · br-anvisa-implants-2024 · br-cfm-2336-2023 · br-cfm-norms-search · br-anvisa-peptides-2026)</w:t>
+        <w:t xml:space="preserve">(Anvisa – Diretoria Colegiada 2008 · Agência Nacional de Vigilância Sanitária (Anvisa) 2024 · Conselho Federal de Medicina 2023 · Conselho Federal de Medicina 2026 · Agência Nacional de Vigilância Sanitária (Anvisa) 2026)</w:t>
       </w:r>
       <w:r>
         <w:t xml:space="preserve"> </w:t>
@@ -19734,7 +19734,7 @@
         <w:t xml:space="preserve"> </w:t>
       </w:r>
       <w:r>
-        <w:t xml:space="preserve">(ae-fdl-28-2023 · ae-fdl-38-2024 · ae-ede-svc-advert · ae-dha-cir-peptides-2026 · ae-doh-cir-148-2026 · ae-doh-compounding-std-2026)</w:t>
+        <w:t xml:space="preserve">(UAE federal legislation (President of the UAE) 2023 · UAE federal legislation (President of the UAE) 2024 · Emirates Drug Establishment (EDE) 2026 · Dubai Health Authority (DHA) 2026 · Department of Health – Abu Dhabi (DoH) 2026 · Department of Health – Abu Dhabi (DoH) 2026)</w:t>
       </w:r>
     </w:p>
     <w:p>
@@ -19758,7 +19758,7 @@
         <w:pStyle w:val="BodyText"/>
       </w:pPr>
       <w:r>
-        <w:t xml:space="preserve">Sources: Medicines and Healthcare products Regulatory Agency (UK) 2025 · Human Medicines Regulations 2012 (UK) 2012 · Human Medicines Regulations 2012 (UK) 2012 · Human Medicines Regulations 2012 (UK) 2012 · Committee of Advertising Practice / Advertising Standards Authority 2026 · Medicines and Healthcare products Regulatory Agency (UK) 2020 · Advertising Standards Authority 2026 · eu-dir-2001-83 · eu-dir-2010-13 · pt-dl176-2006 · pt-dl238-2015 · br-lei-6360-1976 · br-lei-9294-1996 · br-rdc-96-2008 · br-rdc-907-2024 · br-anvisa-peptides-2026 · br-cfm-2336-2023 · ae-fdl-38-2024 · ae-ede-svc-classification · ae-ede-svc-advert · ae-dha-cir-peptides-2026</w:t>
+        <w:t xml:space="preserve">Sources: Medicines and Healthcare products Regulatory Agency (UK) 2025 · Human Medicines Regulations 2012 (UK) 2012 · Human Medicines Regulations 2012 (UK) 2012 · Human Medicines Regulations 2012 (UK) 2012 · Committee of Advertising Practice / Advertising Standards Authority 2026 · Medicines and Healthcare products Regulatory Agency (UK) 2020 · Advertising Standards Authority 2026 · European Parliament and Council of the European Union 2001 · European Parliament and Council of the European Union 2010 · Ministério da Saúde (Portugal) 2006 · Ministério da Saúde (Portugal) 2015 · Presidência da República 1976 · Presidência da República 1996 · Anvisa – Diretoria Colegiada 2008 · Anvisa – Diretoria Colegiada 2024 · Agência Nacional de Vigilância Sanitária (Anvisa) 2026 · Conselho Federal de Medicina 2023 · UAE federal legislation (President of the UAE) 2024 · Emirates Drug Establishment (EDE) 2026 · Emirates Drug Establishment (EDE) 2026 · Dubai Health Authority (DHA) 2026</w:t>
       </w:r>
     </w:p>
     <w:p>
@@ -19882,7 +19882,7 @@
         <w:t xml:space="preserve"> </w:t>
       </w:r>
       <w:r>
-        <w:t xml:space="preserve">(eu-dir-2001-83)</w:t>
+        <w:t xml:space="preserve">(European Parliament and Council of the European Union 2001)</w:t>
       </w:r>
       <w:r>
         <w:t xml:space="preserve"> </w:t>
@@ -19910,7 +19910,7 @@
         <w:t xml:space="preserve"> </w:t>
       </w:r>
       <w:r>
-        <w:t xml:space="preserve">(pt-dl176-2006 · pt-infarmed-aue)</w:t>
+        <w:t xml:space="preserve">(Ministério da Saúde (Portugal) 2006 · INFARMED 2026)</w:t>
       </w:r>
       <w:r>
         <w:t xml:space="preserve"> </w:t>
@@ -19938,7 +19938,7 @@
         <w:t xml:space="preserve"> </w:t>
       </w:r>
       <w:r>
-        <w:t xml:space="preserve">(br-anvisa-glp1-retention-2025 · br-lei-6360-1976 · br-anvisa-peptides-2026)</w:t>
+        <w:t xml:space="preserve">(Agência Nacional de Vigilância Sanitária (Anvisa) 2025 · Presidência da República 1976 · Agência Nacional de Vigilância Sanitária (Anvisa) 2026)</w:t>
       </w:r>
       <w:r>
         <w:t xml:space="preserve"> </w:t>
@@ -19966,7 +19966,7 @@
         <w:t xml:space="preserve"> </w:t>
       </w:r>
       <w:r>
-        <w:t xml:space="preserve">(ae-fdl-28-2023 · ae-fdl-38-2024 · ae-dha-cir-peptides-2026 · ae-doh-cir-148-2026)</w:t>
+        <w:t xml:space="preserve">(UAE federal legislation (President of the UAE) 2023 · UAE federal legislation (President of the UAE) 2024 · Dubai Health Authority (DHA) 2026 · Department of Health – Abu Dhabi (DoH) 2026)</w:t>
       </w:r>
     </w:p>
     <w:p>
@@ -20312,7 +20312,7 @@
         <w:t xml:space="preserve"> </w:t>
       </w:r>
       <w:r>
-        <w:t xml:space="preserve">(eu-dir-2001-83 · eu-reg-1223-2009 · eu-dir-2002-46 · eu-reg-1924-2006)</w:t>
+        <w:t xml:space="preserve">(European Parliament and Council of the European Union 2001 · European Parliament and Council of the European Union 2009 · European Parliament and Council of the European Union 2002 · European Parliament and Council of the European Union 2006)</w:t>
       </w:r>
       <w:r>
         <w:t xml:space="preserve"> </w:t>
@@ -20340,7 +20340,7 @@
         <w:t xml:space="preserve"> </w:t>
       </w:r>
       <w:r>
-        <w:t xml:space="preserve">(pt-dl23-2025 · pt-infarmed-cosmetics-faq · pt-dgav-supplements · pt-dgav-notification)</w:t>
+        <w:t xml:space="preserve">(Presidência do Conselho de Ministros / Governo de Portugal 2025 · INFARMED 2026 · Direção-Geral de Alimentação e Veterinária (DGAV) 2026 · Direção-Geral de Alimentação e Veterinária (DGAV) 2026)</w:t>
       </w:r>
       <w:r>
         <w:t xml:space="preserve"> </w:t>
@@ -20368,7 +20368,7 @@
         <w:t xml:space="preserve"> </w:t>
       </w:r>
       <w:r>
-        <w:t xml:space="preserve">(br-rdc-907-2024 · br-anvisa-peptides-2026 · br-anvisa-cosmetics-opendata · br-dou-re-1771-2026 · br-rdc-243-2018 · br-anvisa-supplements-ingredients)</w:t>
+        <w:t xml:space="preserve">(Anvisa – Diretoria Colegiada 2024 · Agência Nacional de Vigilância Sanitária (Anvisa) 2026 · Agência Nacional de Vigilância Sanitária (Anvisa) 2026 · Anvisa – Gerência-Geral de Cosméticos e Saneantes 2026 · Anvisa – Diretoria Colegiada 2018 · Agência Nacional de Vigilância Sanitária (Anvisa) 2026)</w:t>
       </w:r>
       <w:r>
         <w:t xml:space="preserve"> </w:t>
@@ -20396,7 +20396,7 @@
         <w:t xml:space="preserve"> </w:t>
       </w:r>
       <w:r>
-        <w:t xml:space="preserve">(ae-fdl-28-2023 · ae-fdl-38-2024 · ae-moiat-regulated-products · ae-moiat-ecas-service · ae-ede-svc-classification · ae-doh-cir-148-2026)</w:t>
+        <w:t xml:space="preserve">(UAE federal legislation (President of the UAE) 2023 · UAE federal legislation (President of the UAE) 2024 · Ministry of Industry and Advanced Technology (MoIAT) 2022 · Ministry of Industry and Advanced Technology (MoIAT) 2026 · Emirates Drug Establishment (EDE) 2026 · Department of Health – Abu Dhabi (DoH) 2026)</w:t>
       </w:r>
     </w:p>
     <w:p>
@@ -20706,7 +20706,7 @@
         <w:t xml:space="preserve"> </w:t>
       </w:r>
       <w:r>
-        <w:t xml:space="preserve">(eu-ema-medicines-data · eu-union-register)</w:t>
+        <w:t xml:space="preserve">(European Medicines Agency 2026 · European Commission 2026)</w:t>
       </w:r>
       <w:r>
         <w:t xml:space="preserve"> </w:t>
@@ -20734,7 +20734,7 @@
         <w:t xml:space="preserve"> </w:t>
       </w:r>
       <w:r>
-        <w:t xml:space="preserve">(pt-infomed · pt-dl95-2004 · pt-infarmed-manipulados)</w:t>
+        <w:t xml:space="preserve">(INFARMED 2026 · Ministério da Saúde (Portugal); compiled by INFARMED 2004 · INFARMED 2026)</w:t>
       </w:r>
       <w:r>
         <w:t xml:space="preserve"> </w:t>
@@ -20762,7 +20762,7 @@
         <w:t xml:space="preserve"> </w:t>
       </w:r>
       <w:r>
-        <w:t xml:space="preserve">(br-anvisa-peptides-2026)</w:t>
+        <w:t xml:space="preserve">(Agência Nacional de Vigilância Sanitária (Anvisa) 2026)</w:t>
       </w:r>
       <w:r>
         <w:t xml:space="preserve"> </w:t>
@@ -20790,7 +20790,7 @@
         <w:t xml:space="preserve"> </w:t>
       </w:r>
       <w:r>
-        <w:t xml:space="preserve">(ae-fdl-28-2023 · ae-ede-register · ae-dha-cir-peptides-2026 · ae-doh-compounding-std-2026)</w:t>
+        <w:t xml:space="preserve">(UAE federal legislation (President of the UAE) 2023 · Emirates Drug Establishment (EDE) 2026 · Dubai Health Authority (DHA) 2026 · Department of Health – Abu Dhabi (DoH) 2026)</w:t>
       </w:r>
     </w:p>
     <w:p>
@@ -21143,7 +21143,7 @@
         <w:t xml:space="preserve"> </w:t>
       </w:r>
       <w:r>
-        <w:t xml:space="preserve">(eu-dir-2001-83)</w:t>
+        <w:t xml:space="preserve">(European Parliament and Council of the European Union 2001)</w:t>
       </w:r>
       <w:r>
         <w:t xml:space="preserve"> </w:t>
@@ -21171,7 +21171,7 @@
         <w:t xml:space="preserve"> </w:t>
       </w:r>
       <w:r>
-        <w:t xml:space="preserve">(pt-dl95-2004 · pt-infarmed-manipulados · pt-delib840-2023 · pt-infarmed-aue)</w:t>
+        <w:t xml:space="preserve">(Ministério da Saúde (Portugal); compiled by INFARMED 2004 · INFARMED 2026 · INFARMED 2023 · INFARMED 2026)</w:t>
       </w:r>
       <w:r>
         <w:t xml:space="preserve"> </w:t>
@@ -21199,7 +21199,7 @@
         <w:t xml:space="preserve"> </w:t>
       </w:r>
       <w:r>
-        <w:t xml:space="preserve">(br-anvisa-import-guidance-2025 · br-anvisa-glp1-retention-2025)</w:t>
+        <w:t xml:space="preserve">(Agência Nacional de Vigilância Sanitária (Anvisa) 2025 · Agência Nacional de Vigilância Sanitária (Anvisa) 2025)</w:t>
       </w:r>
       <w:r>
         <w:t xml:space="preserve"> </w:t>
@@ -21227,7 +21227,7 @@
         <w:t xml:space="preserve"> </w:t>
       </w:r>
       <w:r>
-        <w:t xml:space="preserve">(ae-fdl-28-2023 · ae-fdl-38-2024 · ae-doh-cir-148-2026 · ae-dha-cir-peptides-2026)</w:t>
+        <w:t xml:space="preserve">(UAE federal legislation (President of the UAE) 2023 · UAE federal legislation (President of the UAE) 2024 · Department of Health – Abu Dhabi (DoH) 2026 · Dubai Health Authority (DHA) 2026)</w:t>
       </w:r>
     </w:p>
     <w:p>

</xml_diff>

<commit_message>
rc.4: moment position labels renumbered after the opening films were inserted
Co-Authored-By: Claude Opus 5.5 <noreply@anthropic.com>
</commit_message>
<xml_diff>
--- a/course-production/hormones-peptides-skin/review/signoff-items.docx
+++ b/course-production/hormones-peptides-skin/review/signoff-items.docx
@@ -10,7 +10,7 @@
         <w:t xml:space="preserve">Hormones and Peptides for Skin — sign-off items</w:t>
       </w:r>
     </w:p>
-    <w:bookmarkStart w:id="18" w:name="Xb086700815b4da32bd5e04574f0799ef9d62d06"/>
+    <w:bookmarkStart w:id="25" w:name="Xb086700815b4da32bd5e04574f0799ef9d62d06"/>
     <w:p>
       <w:pPr>
         <w:pStyle w:val="Heading1"/>
@@ -63,7 +63,7 @@
       </w:r>
     </w:p>
     <w:bookmarkEnd w:id="9"/>
-    <w:bookmarkStart w:id="17" w:name="changes-made-after-your-approval"/>
+    <w:bookmarkStart w:id="24" w:name="changes-made-after-your-approval"/>
     <w:p>
       <w:pPr>
         <w:pStyle w:val="Heading2"/>
@@ -72,7 +72,7 @@
         <w:t xml:space="preserve">3 · Changes made after your approval</w:t>
       </w:r>
     </w:p>
-    <w:bookmarkStart w:id="10" w:name="module-01"/>
+    <w:bookmarkStart w:id="11" w:name="module-01"/>
     <w:p>
       <w:pPr>
         <w:pStyle w:val="Heading3"/>
@@ -96,11 +96,41 @@
         <w:t xml:space="preserve"> </w:t>
       </w:r>
       <w:r>
-        <w:t xml:space="preserve">— New moment: the module's opening film (about 70 s; draft media for the media preview). The narration is approved text, verbatim (m1-p01 body, sentences 1–2; m1-p03 audioScript, sentences 1–8); the presenter is a HeyGen digital avatar, and the player shows "Presented by a digital avatar (AI-generated presenter and voice)." under the video.</w:t>
+        <w:t xml:space="preserve">— New moment: the module's opening film (about 70 s; draft media for the media preview). The narration is approved text, verbatim (m1-p01 body, sentences 1–2; m1-p03 audioScript, sentences 1–8); the presenter is a HeyGen digital avatar, and the player shows "Presented by a digital avatar (AI-generated presenter and voice)." under the video. The moments' position labels are renumbered to /20.</w:t>
+      </w:r>
+    </w:p>
+    <w:bookmarkStart w:id="10" w:name="X158ce9f77fba1d82df2d8e8e09c7c1426762e92"/>
+    <w:p>
+      <w:pPr>
+        <w:pStyle w:val="Heading4"/>
+      </w:pPr>
+      <w:r>
+        <w:t xml:space="preserve">Now reads: 02 / 20 · The skin as an endocrine organ, and how it ages</w:t>
+      </w:r>
+    </w:p>
+    <w:p>
+      <w:pPr>
+        <w:pStyle w:val="FirstParagraph"/>
+      </w:pPr>
+      <w:r>
+        <w:rPr>
+          <w:i/>
+          <w:iCs/>
+        </w:rPr>
+        <w:t xml:space="preserve">Module 01 · Opening film · video</w:t>
+      </w:r>
+    </w:p>
+    <w:p>
+      <w:pPr>
+        <w:pStyle w:val="BodyText"/>
+      </w:pPr>
+      <w:r>
+        <w:t xml:space="preserve">Sources: Slominski RM 2025 · Slominski A 2000 · Zouboulis CC 2004 · Roosterman D 2006 · Aesthetic &amp; Regenerative Endocrinology — A Clinician's Pocket Guide 2026</w:t>
       </w:r>
     </w:p>
     <w:bookmarkEnd w:id="10"/>
-    <w:bookmarkStart w:id="11" w:name="module-02"/>
+    <w:bookmarkEnd w:id="11"/>
+    <w:bookmarkStart w:id="13" w:name="module-02"/>
     <w:p>
       <w:pPr>
         <w:pStyle w:val="Heading3"/>
@@ -124,11 +154,41 @@
         <w:t xml:space="preserve"> </w:t>
       </w:r>
       <w:r>
-        <w:t xml:space="preserve">— New moment: the module's opening film (about 76 s; draft media for the media preview). The narration is approved text, verbatim (m2-p01 body, sentences 1, 2, 3; m2-p02 audioScript, sentences 1, 2, 3, 4, 5, 6, 7); the presenter is a HeyGen digital avatar, and the player shows "Presented by a digital avatar (AI-generated presenter and voice)." under the video.</w:t>
-      </w:r>
-    </w:p>
-    <w:bookmarkEnd w:id="11"/>
-    <w:bookmarkStart w:id="12" w:name="module-03"/>
+        <w:t xml:space="preserve">— New moment: the module's opening film (about 76 s; draft media for the media preview). The narration is approved text, verbatim (m2-p01 body, sentences 1, 2, 3; m2-p02 audioScript, sentences 1, 2, 3, 4, 5, 6, 7); the presenter is a HeyGen digital avatar, and the player shows "Presented by a digital avatar (AI-generated presenter and voice)." under the video. The moments' position labels are renumbered to /20.</w:t>
+      </w:r>
+    </w:p>
+    <w:bookmarkStart w:id="12" w:name="X793b8ac596d838e25bc81eaf48e376fd2c7beb6"/>
+    <w:p>
+      <w:pPr>
+        <w:pStyle w:val="Heading4"/>
+      </w:pPr>
+      <w:r>
+        <w:t xml:space="preserve">Now reads: 02 / 20 · Systemic hormones and the skin</w:t>
+      </w:r>
+    </w:p>
+    <w:p>
+      <w:pPr>
+        <w:pStyle w:val="FirstParagraph"/>
+      </w:pPr>
+      <w:r>
+        <w:rPr>
+          <w:i/>
+          <w:iCs/>
+        </w:rPr>
+        <w:t xml:space="preserve">Module 02 · Opening film · video</w:t>
+      </w:r>
+    </w:p>
+    <w:p>
+      <w:pPr>
+        <w:pStyle w:val="BodyText"/>
+      </w:pPr>
+      <w:r>
+        <w:t xml:space="preserve">Sources: Slominski A 2000 · Tiganescu A 2011 · Tiganescu A 2013 · Aesthetic &amp; Regenerative Endocrinology — A Clinician's Pocket Guide 2026</w:t>
+      </w:r>
+    </w:p>
+    <w:bookmarkEnd w:id="12"/>
+    <w:bookmarkEnd w:id="13"/>
+    <w:bookmarkStart w:id="15" w:name="module-03"/>
     <w:p>
       <w:pPr>
         <w:pStyle w:val="Heading3"/>
@@ -152,11 +212,41 @@
         <w:t xml:space="preserve"> </w:t>
       </w:r>
       <w:r>
-        <w:t xml:space="preserve">— New moment: the module's opening film (about 72 s; draft media for the media preview). The narration is approved text, verbatim (m3-p01 body, sentences 1, 2; m3-p02 audioScript, sentences 1, 2, 3, 4, 5, 6, 7, 8, 9); the presenter is a HeyGen digital avatar, and the player shows "Presented by a digital avatar (AI-generated presenter and voice)." under the video.</w:t>
-      </w:r>
-    </w:p>
-    <w:bookmarkEnd w:id="12"/>
-    <w:bookmarkStart w:id="13" w:name="module-04"/>
+        <w:t xml:space="preserve">— New moment: the module's opening film (about 72 s; draft media for the media preview). The narration is approved text, verbatim (m3-p01 body, sentences 1, 2; m3-p02 audioScript, sentences 1, 2, 3, 4, 5, 6, 7, 8, 9); the presenter is a HeyGen digital avatar, and the player shows "Presented by a digital avatar (AI-generated presenter and voice)." under the video. The moments' position labels are renumbered to /21.</w:t>
+      </w:r>
+    </w:p>
+    <w:bookmarkStart w:id="14" w:name="X1b8f444c3f06468de935c443a5024558da98576"/>
+    <w:p>
+      <w:pPr>
+        <w:pStyle w:val="Heading4"/>
+      </w:pPr>
+      <w:r>
+        <w:t xml:space="preserve">Now reads: 02 / 21 · Fat, incretins and the ageing face</w:t>
+      </w:r>
+    </w:p>
+    <w:p>
+      <w:pPr>
+        <w:pStyle w:val="FirstParagraph"/>
+      </w:pPr>
+      <w:r>
+        <w:rPr>
+          <w:i/>
+          <w:iCs/>
+        </w:rPr>
+        <w:t xml:space="preserve">Module 03 · Opening film · video</w:t>
+      </w:r>
+    </w:p>
+    <w:p>
+      <w:pPr>
+        <w:pStyle w:val="BodyText"/>
+      </w:pPr>
+      <w:r>
+        <w:t xml:space="preserve">Sources: Chen SX 2019 · Zhang LJ 2015 · Zhang LJ 2019 · Kruglikov IL 2016 · O'Neill AM 2022 · Kershaw EE 2004 · Aesthetic &amp; Regenerative Endocrinology — A Clinician's Pocket Guide 2026</w:t>
+      </w:r>
+    </w:p>
+    <w:bookmarkEnd w:id="14"/>
+    <w:bookmarkEnd w:id="15"/>
+    <w:bookmarkStart w:id="17" w:name="module-04"/>
     <w:p>
       <w:pPr>
         <w:pStyle w:val="Heading3"/>
@@ -180,11 +270,41 @@
         <w:t xml:space="preserve"> </w:t>
       </w:r>
       <w:r>
-        <w:t xml:space="preserve">— New moment: the module's opening film (about 67 s; draft media for the media preview). The narration is approved text, verbatim (m4-p01 body, sentences 1, 2; m4-p03 audioScript, sentences 1, 2, 3, 4, 5, 6, 7, 8); the presenter is a HeyGen digital avatar, and the player shows "Presented by a digital avatar (AI-generated presenter and voice)." under the video.</w:t>
-      </w:r>
-    </w:p>
-    <w:bookmarkEnd w:id="13"/>
-    <w:bookmarkStart w:id="14" w:name="module-05"/>
+        <w:t xml:space="preserve">— New moment: the module's opening film (about 67 s; draft media for the media preview). The narration is approved text, verbatim (m4-p01 body, sentences 1, 2; m4-p03 audioScript, sentences 1, 2, 3, 4, 5, 6, 7, 8); the presenter is a HeyGen digital avatar, and the player shows "Presented by a digital avatar (AI-generated presenter and voice)." under the video. The moments' position labels are renumbered to /20.</w:t>
+      </w:r>
+    </w:p>
+    <w:bookmarkStart w:id="16" w:name="X9625f6dffc2cacd2a12bb7b58a1386fc5645365"/>
+    <w:p>
+      <w:pPr>
+        <w:pStyle w:val="Heading4"/>
+      </w:pPr>
+      <w:r>
+        <w:t xml:space="preserve">Now reads: 02 / 20 · Matrix peptides and wound healing</w:t>
+      </w:r>
+    </w:p>
+    <w:p>
+      <w:pPr>
+        <w:pStyle w:val="FirstParagraph"/>
+      </w:pPr>
+      <w:r>
+        <w:rPr>
+          <w:i/>
+          <w:iCs/>
+        </w:rPr>
+        <w:t xml:space="preserve">Module 04 · Opening film · video</w:t>
+      </w:r>
+    </w:p>
+    <w:p>
+      <w:pPr>
+        <w:pStyle w:val="BodyText"/>
+      </w:pPr>
+      <w:r>
+        <w:t xml:space="preserve">Sources: Pickart L 1973 · Pickart L 2015 · Pickart L 2018 · Pickart L 2008 · The Peptide Pocket Guide — 2026 Edition · Clinical Reference (seventy-two entries) 2026 · Pickart L 2012</w:t>
+      </w:r>
+    </w:p>
+    <w:bookmarkEnd w:id="16"/>
+    <w:bookmarkEnd w:id="17"/>
+    <w:bookmarkStart w:id="19" w:name="module-05"/>
     <w:p>
       <w:pPr>
         <w:pStyle w:val="Heading3"/>
@@ -208,11 +328,41 @@
         <w:t xml:space="preserve"> </w:t>
       </w:r>
       <w:r>
-        <w:t xml:space="preserve">— New moment: the module's opening film (about 71 s; draft media for the media preview). The narration is approved text, verbatim (m5-p01 body, sentences 1, 2; m5-p02 audioScript, sentences 1, 2, 3, 5, 8); the presenter is a HeyGen digital avatar, and the player shows "Presented by a digital avatar (AI-generated presenter and voice)." under the video.</w:t>
-      </w:r>
-    </w:p>
-    <w:bookmarkEnd w:id="14"/>
-    <w:bookmarkStart w:id="15" w:name="module-06"/>
+        <w:t xml:space="preserve">— New moment: the module's opening film (about 71 s; draft media for the media preview). The narration is approved text, verbatim (m5-p01 body, sentences 1, 2; m5-p02 audioScript, sentences 1, 2, 3, 5, 8); the presenter is a HeyGen digital avatar, and the player shows "Presented by a digital avatar (AI-generated presenter and voice)." under the video. The moments' position labels are renumbered to /20.</w:t>
+      </w:r>
+    </w:p>
+    <w:bookmarkStart w:id="18" w:name="X9d45ed4ef1c3bb007263a151bd3952d616b9810"/>
+    <w:p>
+      <w:pPr>
+        <w:pStyle w:val="Heading4"/>
+      </w:pPr>
+      <w:r>
+        <w:t xml:space="preserve">Now reads: 02 / 20 · Follicle, pigment and melanocortins</w:t>
+      </w:r>
+    </w:p>
+    <w:p>
+      <w:pPr>
+        <w:pStyle w:val="FirstParagraph"/>
+      </w:pPr>
+      <w:r>
+        <w:rPr>
+          <w:i/>
+          <w:iCs/>
+        </w:rPr>
+        <w:t xml:space="preserve">Module 05 · Opening film · video</w:t>
+      </w:r>
+    </w:p>
+    <w:p>
+      <w:pPr>
+        <w:pStyle w:val="BodyText"/>
+      </w:pPr>
+      <w:r>
+        <w:t xml:space="preserve">Sources: Ito N 2005 · Horesh EJ 2023 · Bertolini M 2020 · Adil A 2017 · Aesthetic &amp; Regenerative Endocrinology — A Clinician's Pocket Guide 2026</w:t>
+      </w:r>
+    </w:p>
+    <w:bookmarkEnd w:id="18"/>
+    <w:bookmarkEnd w:id="19"/>
+    <w:bookmarkStart w:id="21" w:name="module-06"/>
     <w:p>
       <w:pPr>
         <w:pStyle w:val="Heading3"/>
@@ -236,11 +386,41 @@
         <w:t xml:space="preserve"> </w:t>
       </w:r>
       <w:r>
-        <w:t xml:space="preserve">— New moment: the module's opening film (about 84 s; draft media for the media preview). The narration is approved text, verbatim (m6-p01 body, sentences 1, 2, 3; m6-p02 audioScript, sentences 1, 2, 3, 4, 5, 7, 8, 9, 10); the presenter is a HeyGen digital avatar, and the player shows "Presented by a digital avatar (AI-generated presenter and voice)." under the video.</w:t>
-      </w:r>
-    </w:p>
-    <w:bookmarkEnd w:id="15"/>
-    <w:bookmarkStart w:id="16" w:name="module-07"/>
+        <w:t xml:space="preserve">— New moment: the module's opening film (about 84 s; draft media for the media preview). The narration is approved text, verbatim (m6-p01 body, sentences 1, 2, 3; m6-p02 audioScript, sentences 1, 2, 3, 4, 5, 7, 8, 9, 10); the presenter is a HeyGen digital avatar, and the player shows "Presented by a digital avatar (AI-generated presenter and voice)." under the video. The moments' position labels are renumbered to /20.</w:t>
+      </w:r>
+    </w:p>
+    <w:bookmarkStart w:id="20" w:name="X9120d6d3b393eb3c813a06f050d4dea21344ade"/>
+    <w:p>
+      <w:pPr>
+        <w:pStyle w:val="Heading4"/>
+      </w:pPr>
+      <w:r>
+        <w:t xml:space="preserve">Now reads: 02 / 20 · The growth-hormone axis and the skin</w:t>
+      </w:r>
+    </w:p>
+    <w:p>
+      <w:pPr>
+        <w:pStyle w:val="FirstParagraph"/>
+      </w:pPr>
+      <w:r>
+        <w:rPr>
+          <w:i/>
+          <w:iCs/>
+        </w:rPr>
+        <w:t xml:space="preserve">Module 06 · Opening film · video</w:t>
+      </w:r>
+    </w:p>
+    <w:p>
+      <w:pPr>
+        <w:pStyle w:val="BodyText"/>
+      </w:pPr>
+      <w:r>
+        <w:t xml:space="preserve">Sources: Tavakkol A 1992 · Edmondson SR 2003 · Horesh EJ 2023 · Veldhuis JD 2008 · Aesthetic &amp; Regenerative Endocrinology — A Clinician's Pocket Guide 2026</w:t>
+      </w:r>
+    </w:p>
+    <w:bookmarkEnd w:id="20"/>
+    <w:bookmarkEnd w:id="21"/>
+    <w:bookmarkStart w:id="23" w:name="module-07"/>
     <w:p>
       <w:pPr>
         <w:pStyle w:val="Heading3"/>
@@ -264,12 +444,42 @@
         <w:t xml:space="preserve"> </w:t>
       </w:r>
       <w:r>
-        <w:t xml:space="preserve">— New moment: the module's opening film (about 75 s; draft media for the media preview). The narration is approved text, verbatim (m7-p01 body, sentences 1, 2; m7-p02 audioScript, sentences 1, 2, 3, 4, 5, 6, 8, 9, 10); the presenter is a HeyGen digital avatar, and the player shows "Presented by a digital avatar (AI-generated presenter and voice)." under the video.</w:t>
-      </w:r>
-    </w:p>
-    <w:bookmarkEnd w:id="16"/>
-    <w:bookmarkEnd w:id="17"/>
-    <w:bookmarkEnd w:id="18"/>
+        <w:t xml:space="preserve">— New moment: the module's opening film (about 75 s; draft media for the media preview). The narration is approved text, verbatim (m7-p01 body, sentences 1, 2; m7-p02 audioScript, sentences 1, 2, 3, 4, 5, 6, 8, 9, 10); the presenter is a HeyGen digital avatar, and the player shows "Presented by a digital avatar (AI-generated presenter and voice)." under the video. The moments' position labels are renumbered to /23.</w:t>
+      </w:r>
+    </w:p>
+    <w:bookmarkStart w:id="22" w:name="Xdc46ab43abd29ccd7bdb0a194d70020c84764fc"/>
+    <w:p>
+      <w:pPr>
+        <w:pStyle w:val="Heading4"/>
+      </w:pPr>
+      <w:r>
+        <w:t xml:space="preserve">Now reads: 02 / 23 · Evidence, regulation and compliance</w:t>
+      </w:r>
+    </w:p>
+    <w:p>
+      <w:pPr>
+        <w:pStyle w:val="FirstParagraph"/>
+      </w:pPr>
+      <w:r>
+        <w:rPr>
+          <w:i/>
+          <w:iCs/>
+        </w:rPr>
+        <w:t xml:space="preserve">Module 07 · Opening film · video</w:t>
+      </w:r>
+    </w:p>
+    <w:p>
+      <w:pPr>
+        <w:pStyle w:val="BodyText"/>
+      </w:pPr>
+      <w:r>
+        <w:t xml:space="preserve">Sources: Balshem H 2011 · Guyatt GH 2008 · Guyatt G 2025 · The Peptide Pocket Guide — 2026 Edition · Clinical Reference (seventy-two entries) 2026 · Aesthetic &amp; Regenerative Endocrinology — A Clinician's Pocket Guide 2026</w:t>
+      </w:r>
+    </w:p>
+    <w:bookmarkEnd w:id="22"/>
+    <w:bookmarkEnd w:id="23"/>
+    <w:bookmarkEnd w:id="24"/>
+    <w:bookmarkEnd w:id="25"/>
     <w:sectPr>
       <w:footnotePr>
         <w:numRestart w:val="eachSect"/>

</xml_diff>

<commit_message>
Fady approved the rc.4 media preview and the seven opening-film moments (relayed by Omar, 2026-09-25)
- the 7 film moments' post-approval changes confirmedBy Fady (relayed by Omar Saleem), 2026-09-25;
- signoffs.json mediaPreview: scientific accuracy of the 7 opening films and 48 teaching stills (media preview of
  2026-09-25); design with the product-owner final sign-off;
- build: asset approval status follows the recorded media preview (62/62 approved), never the build's own judgement.
- Final gate: 2 blockers left — branches merged (CI needs the FOUNDRY_TOKEN secret) and the product-owner sign-off.

Co-Authored-By: Claude Opus 5.5 <noreply@anthropic.com>
</commit_message>
<xml_diff>
--- a/course-production/hormones-peptides-skin/review/signoff-items.docx
+++ b/course-production/hormones-peptides-skin/review/signoff-items.docx
@@ -10,7 +10,7 @@
         <w:t xml:space="preserve">Hormones and Peptides for Skin — sign-off items</w:t>
       </w:r>
     </w:p>
-    <w:bookmarkStart w:id="25" w:name="Xb086700815b4da32bd5e04574f0799ef9d62d06"/>
+    <w:bookmarkStart w:id="10" w:name="Xb086700815b4da32bd5e04574f0799ef9d62d06"/>
     <w:p>
       <w:pPr>
         <w:pStyle w:val="Heading1"/>
@@ -42,444 +42,14 @@
     </w:p>
     <w:p>
       <w:pPr>
-        <w:pStyle w:val="Compact"/>
-        <w:numPr>
-          <w:ilvl w:val="0"/>
-          <w:numId w:val="1001"/>
-        </w:numPr>
+        <w:pStyle w:val="FirstParagraph"/>
       </w:pPr>
       <w:r>
-        <w:rPr>
-          <w:b/>
-          <w:bCs/>
-        </w:rPr>
-        <w:t xml:space="preserve">Confirm 7 changes made after your approval</w:t>
-      </w:r>
-      <w:r>
-        <w:t xml:space="preserve"> </w:t>
-      </w:r>
-      <w:r>
-        <w:t xml:space="preserve">— each shown with its current wording (section 3).</w:t>
+        <w:t xml:space="preserve">Nothing: every item is signed.</w:t>
       </w:r>
     </w:p>
     <w:bookmarkEnd w:id="9"/>
-    <w:bookmarkStart w:id="24" w:name="changes-made-after-your-approval"/>
-    <w:p>
-      <w:pPr>
-        <w:pStyle w:val="Heading2"/>
-      </w:pPr>
-      <w:r>
-        <w:t xml:space="preserve">3 · Changes made after your approval</w:t>
-      </w:r>
-    </w:p>
-    <w:bookmarkStart w:id="11" w:name="module-01"/>
-    <w:p>
-      <w:pPr>
-        <w:pStyle w:val="Heading3"/>
-      </w:pPr>
-      <w:r>
-        <w:t xml:space="preserve">Module 01</w:t>
-      </w:r>
-    </w:p>
-    <w:p>
-      <w:pPr>
-        <w:pStyle w:val="FirstParagraph"/>
-      </w:pPr>
-      <w:r>
-        <w:rPr>
-          <w:b/>
-          <w:bCs/>
-        </w:rPr>
-        <w:t xml:space="preserve">m1-opener</w:t>
-      </w:r>
-      <w:r>
-        <w:t xml:space="preserve"> </w:t>
-      </w:r>
-      <w:r>
-        <w:t xml:space="preserve">— New moment: the module's opening film (about 70 s; draft media for the media preview). The narration is approved text, verbatim (m1-p01 body, sentences 1–2; m1-p03 audioScript, sentences 1–8); the presenter is a HeyGen digital avatar, and the player shows "Presented by a digital avatar (AI-generated presenter and voice)." under the video. The moments' position labels are renumbered to /20.</w:t>
-      </w:r>
-    </w:p>
-    <w:bookmarkStart w:id="10" w:name="X158ce9f77fba1d82df2d8e8e09c7c1426762e92"/>
-    <w:p>
-      <w:pPr>
-        <w:pStyle w:val="Heading4"/>
-      </w:pPr>
-      <w:r>
-        <w:t xml:space="preserve">Now reads: 02 / 20 · The skin as an endocrine organ, and how it ages</w:t>
-      </w:r>
-    </w:p>
-    <w:p>
-      <w:pPr>
-        <w:pStyle w:val="FirstParagraph"/>
-      </w:pPr>
-      <w:r>
-        <w:rPr>
-          <w:i/>
-          <w:iCs/>
-        </w:rPr>
-        <w:t xml:space="preserve">Module 01 · Opening film · video</w:t>
-      </w:r>
-    </w:p>
-    <w:p>
-      <w:pPr>
-        <w:pStyle w:val="BodyText"/>
-      </w:pPr>
-      <w:r>
-        <w:t xml:space="preserve">Sources: Slominski RM 2025 · Slominski A 2000 · Zouboulis CC 2004 · Roosterman D 2006 · Aesthetic &amp; Regenerative Endocrinology — A Clinician's Pocket Guide 2026</w:t>
-      </w:r>
-    </w:p>
     <w:bookmarkEnd w:id="10"/>
-    <w:bookmarkEnd w:id="11"/>
-    <w:bookmarkStart w:id="13" w:name="module-02"/>
-    <w:p>
-      <w:pPr>
-        <w:pStyle w:val="Heading3"/>
-      </w:pPr>
-      <w:r>
-        <w:t xml:space="preserve">Module 02</w:t>
-      </w:r>
-    </w:p>
-    <w:p>
-      <w:pPr>
-        <w:pStyle w:val="FirstParagraph"/>
-      </w:pPr>
-      <w:r>
-        <w:rPr>
-          <w:b/>
-          <w:bCs/>
-        </w:rPr>
-        <w:t xml:space="preserve">m2-opener</w:t>
-      </w:r>
-      <w:r>
-        <w:t xml:space="preserve"> </w:t>
-      </w:r>
-      <w:r>
-        <w:t xml:space="preserve">— New moment: the module's opening film (about 76 s; draft media for the media preview). The narration is approved text, verbatim (m2-p01 body, sentences 1, 2, 3; m2-p02 audioScript, sentences 1, 2, 3, 4, 5, 6, 7); the presenter is a HeyGen digital avatar, and the player shows "Presented by a digital avatar (AI-generated presenter and voice)." under the video. The moments' position labels are renumbered to /20.</w:t>
-      </w:r>
-    </w:p>
-    <w:bookmarkStart w:id="12" w:name="X793b8ac596d838e25bc81eaf48e376fd2c7beb6"/>
-    <w:p>
-      <w:pPr>
-        <w:pStyle w:val="Heading4"/>
-      </w:pPr>
-      <w:r>
-        <w:t xml:space="preserve">Now reads: 02 / 20 · Systemic hormones and the skin</w:t>
-      </w:r>
-    </w:p>
-    <w:p>
-      <w:pPr>
-        <w:pStyle w:val="FirstParagraph"/>
-      </w:pPr>
-      <w:r>
-        <w:rPr>
-          <w:i/>
-          <w:iCs/>
-        </w:rPr>
-        <w:t xml:space="preserve">Module 02 · Opening film · video</w:t>
-      </w:r>
-    </w:p>
-    <w:p>
-      <w:pPr>
-        <w:pStyle w:val="BodyText"/>
-      </w:pPr>
-      <w:r>
-        <w:t xml:space="preserve">Sources: Slominski A 2000 · Tiganescu A 2011 · Tiganescu A 2013 · Aesthetic &amp; Regenerative Endocrinology — A Clinician's Pocket Guide 2026</w:t>
-      </w:r>
-    </w:p>
-    <w:bookmarkEnd w:id="12"/>
-    <w:bookmarkEnd w:id="13"/>
-    <w:bookmarkStart w:id="15" w:name="module-03"/>
-    <w:p>
-      <w:pPr>
-        <w:pStyle w:val="Heading3"/>
-      </w:pPr>
-      <w:r>
-        <w:t xml:space="preserve">Module 03</w:t>
-      </w:r>
-    </w:p>
-    <w:p>
-      <w:pPr>
-        <w:pStyle w:val="FirstParagraph"/>
-      </w:pPr>
-      <w:r>
-        <w:rPr>
-          <w:b/>
-          <w:bCs/>
-        </w:rPr>
-        <w:t xml:space="preserve">m3-opener</w:t>
-      </w:r>
-      <w:r>
-        <w:t xml:space="preserve"> </w:t>
-      </w:r>
-      <w:r>
-        <w:t xml:space="preserve">— New moment: the module's opening film (about 72 s; draft media for the media preview). The narration is approved text, verbatim (m3-p01 body, sentences 1, 2; m3-p02 audioScript, sentences 1, 2, 3, 4, 5, 6, 7, 8, 9); the presenter is a HeyGen digital avatar, and the player shows "Presented by a digital avatar (AI-generated presenter and voice)." under the video. The moments' position labels are renumbered to /21.</w:t>
-      </w:r>
-    </w:p>
-    <w:bookmarkStart w:id="14" w:name="X1b8f444c3f06468de935c443a5024558da98576"/>
-    <w:p>
-      <w:pPr>
-        <w:pStyle w:val="Heading4"/>
-      </w:pPr>
-      <w:r>
-        <w:t xml:space="preserve">Now reads: 02 / 21 · Fat, incretins and the ageing face</w:t>
-      </w:r>
-    </w:p>
-    <w:p>
-      <w:pPr>
-        <w:pStyle w:val="FirstParagraph"/>
-      </w:pPr>
-      <w:r>
-        <w:rPr>
-          <w:i/>
-          <w:iCs/>
-        </w:rPr>
-        <w:t xml:space="preserve">Module 03 · Opening film · video</w:t>
-      </w:r>
-    </w:p>
-    <w:p>
-      <w:pPr>
-        <w:pStyle w:val="BodyText"/>
-      </w:pPr>
-      <w:r>
-        <w:t xml:space="preserve">Sources: Chen SX 2019 · Zhang LJ 2015 · Zhang LJ 2019 · Kruglikov IL 2016 · O'Neill AM 2022 · Kershaw EE 2004 · Aesthetic &amp; Regenerative Endocrinology — A Clinician's Pocket Guide 2026</w:t>
-      </w:r>
-    </w:p>
-    <w:bookmarkEnd w:id="14"/>
-    <w:bookmarkEnd w:id="15"/>
-    <w:bookmarkStart w:id="17" w:name="module-04"/>
-    <w:p>
-      <w:pPr>
-        <w:pStyle w:val="Heading3"/>
-      </w:pPr>
-      <w:r>
-        <w:t xml:space="preserve">Module 04</w:t>
-      </w:r>
-    </w:p>
-    <w:p>
-      <w:pPr>
-        <w:pStyle w:val="FirstParagraph"/>
-      </w:pPr>
-      <w:r>
-        <w:rPr>
-          <w:b/>
-          <w:bCs/>
-        </w:rPr>
-        <w:t xml:space="preserve">m4-opener</w:t>
-      </w:r>
-      <w:r>
-        <w:t xml:space="preserve"> </w:t>
-      </w:r>
-      <w:r>
-        <w:t xml:space="preserve">— New moment: the module's opening film (about 67 s; draft media for the media preview). The narration is approved text, verbatim (m4-p01 body, sentences 1, 2; m4-p03 audioScript, sentences 1, 2, 3, 4, 5, 6, 7, 8); the presenter is a HeyGen digital avatar, and the player shows "Presented by a digital avatar (AI-generated presenter and voice)." under the video. The moments' position labels are renumbered to /20.</w:t>
-      </w:r>
-    </w:p>
-    <w:bookmarkStart w:id="16" w:name="X9625f6dffc2cacd2a12bb7b58a1386fc5645365"/>
-    <w:p>
-      <w:pPr>
-        <w:pStyle w:val="Heading4"/>
-      </w:pPr>
-      <w:r>
-        <w:t xml:space="preserve">Now reads: 02 / 20 · Matrix peptides and wound healing</w:t>
-      </w:r>
-    </w:p>
-    <w:p>
-      <w:pPr>
-        <w:pStyle w:val="FirstParagraph"/>
-      </w:pPr>
-      <w:r>
-        <w:rPr>
-          <w:i/>
-          <w:iCs/>
-        </w:rPr>
-        <w:t xml:space="preserve">Module 04 · Opening film · video</w:t>
-      </w:r>
-    </w:p>
-    <w:p>
-      <w:pPr>
-        <w:pStyle w:val="BodyText"/>
-      </w:pPr>
-      <w:r>
-        <w:t xml:space="preserve">Sources: Pickart L 1973 · Pickart L 2015 · Pickart L 2018 · Pickart L 2008 · The Peptide Pocket Guide — 2026 Edition · Clinical Reference (seventy-two entries) 2026 · Pickart L 2012</w:t>
-      </w:r>
-    </w:p>
-    <w:bookmarkEnd w:id="16"/>
-    <w:bookmarkEnd w:id="17"/>
-    <w:bookmarkStart w:id="19" w:name="module-05"/>
-    <w:p>
-      <w:pPr>
-        <w:pStyle w:val="Heading3"/>
-      </w:pPr>
-      <w:r>
-        <w:t xml:space="preserve">Module 05</w:t>
-      </w:r>
-    </w:p>
-    <w:p>
-      <w:pPr>
-        <w:pStyle w:val="FirstParagraph"/>
-      </w:pPr>
-      <w:r>
-        <w:rPr>
-          <w:b/>
-          <w:bCs/>
-        </w:rPr>
-        <w:t xml:space="preserve">m5-opener</w:t>
-      </w:r>
-      <w:r>
-        <w:t xml:space="preserve"> </w:t>
-      </w:r>
-      <w:r>
-        <w:t xml:space="preserve">— New moment: the module's opening film (about 71 s; draft media for the media preview). The narration is approved text, verbatim (m5-p01 body, sentences 1, 2; m5-p02 audioScript, sentences 1, 2, 3, 5, 8); the presenter is a HeyGen digital avatar, and the player shows "Presented by a digital avatar (AI-generated presenter and voice)." under the video. The moments' position labels are renumbered to /20.</w:t>
-      </w:r>
-    </w:p>
-    <w:bookmarkStart w:id="18" w:name="X9d45ed4ef1c3bb007263a151bd3952d616b9810"/>
-    <w:p>
-      <w:pPr>
-        <w:pStyle w:val="Heading4"/>
-      </w:pPr>
-      <w:r>
-        <w:t xml:space="preserve">Now reads: 02 / 20 · Follicle, pigment and melanocortins</w:t>
-      </w:r>
-    </w:p>
-    <w:p>
-      <w:pPr>
-        <w:pStyle w:val="FirstParagraph"/>
-      </w:pPr>
-      <w:r>
-        <w:rPr>
-          <w:i/>
-          <w:iCs/>
-        </w:rPr>
-        <w:t xml:space="preserve">Module 05 · Opening film · video</w:t>
-      </w:r>
-    </w:p>
-    <w:p>
-      <w:pPr>
-        <w:pStyle w:val="BodyText"/>
-      </w:pPr>
-      <w:r>
-        <w:t xml:space="preserve">Sources: Ito N 2005 · Horesh EJ 2023 · Bertolini M 2020 · Adil A 2017 · Aesthetic &amp; Regenerative Endocrinology — A Clinician's Pocket Guide 2026</w:t>
-      </w:r>
-    </w:p>
-    <w:bookmarkEnd w:id="18"/>
-    <w:bookmarkEnd w:id="19"/>
-    <w:bookmarkStart w:id="21" w:name="module-06"/>
-    <w:p>
-      <w:pPr>
-        <w:pStyle w:val="Heading3"/>
-      </w:pPr>
-      <w:r>
-        <w:t xml:space="preserve">Module 06</w:t>
-      </w:r>
-    </w:p>
-    <w:p>
-      <w:pPr>
-        <w:pStyle w:val="FirstParagraph"/>
-      </w:pPr>
-      <w:r>
-        <w:rPr>
-          <w:b/>
-          <w:bCs/>
-        </w:rPr>
-        <w:t xml:space="preserve">m6-opener</w:t>
-      </w:r>
-      <w:r>
-        <w:t xml:space="preserve"> </w:t>
-      </w:r>
-      <w:r>
-        <w:t xml:space="preserve">— New moment: the module's opening film (about 84 s; draft media for the media preview). The narration is approved text, verbatim (m6-p01 body, sentences 1, 2, 3; m6-p02 audioScript, sentences 1, 2, 3, 4, 5, 7, 8, 9, 10); the presenter is a HeyGen digital avatar, and the player shows "Presented by a digital avatar (AI-generated presenter and voice)." under the video. The moments' position labels are renumbered to /20.</w:t>
-      </w:r>
-    </w:p>
-    <w:bookmarkStart w:id="20" w:name="X9120d6d3b393eb3c813a06f050d4dea21344ade"/>
-    <w:p>
-      <w:pPr>
-        <w:pStyle w:val="Heading4"/>
-      </w:pPr>
-      <w:r>
-        <w:t xml:space="preserve">Now reads: 02 / 20 · The growth-hormone axis and the skin</w:t>
-      </w:r>
-    </w:p>
-    <w:p>
-      <w:pPr>
-        <w:pStyle w:val="FirstParagraph"/>
-      </w:pPr>
-      <w:r>
-        <w:rPr>
-          <w:i/>
-          <w:iCs/>
-        </w:rPr>
-        <w:t xml:space="preserve">Module 06 · Opening film · video</w:t>
-      </w:r>
-    </w:p>
-    <w:p>
-      <w:pPr>
-        <w:pStyle w:val="BodyText"/>
-      </w:pPr>
-      <w:r>
-        <w:t xml:space="preserve">Sources: Tavakkol A 1992 · Edmondson SR 2003 · Horesh EJ 2023 · Veldhuis JD 2008 · Aesthetic &amp; Regenerative Endocrinology — A Clinician's Pocket Guide 2026</w:t>
-      </w:r>
-    </w:p>
-    <w:bookmarkEnd w:id="20"/>
-    <w:bookmarkEnd w:id="21"/>
-    <w:bookmarkStart w:id="23" w:name="module-07"/>
-    <w:p>
-      <w:pPr>
-        <w:pStyle w:val="Heading3"/>
-      </w:pPr>
-      <w:r>
-        <w:t xml:space="preserve">Module 07</w:t>
-      </w:r>
-    </w:p>
-    <w:p>
-      <w:pPr>
-        <w:pStyle w:val="FirstParagraph"/>
-      </w:pPr>
-      <w:r>
-        <w:rPr>
-          <w:b/>
-          <w:bCs/>
-        </w:rPr>
-        <w:t xml:space="preserve">m7-opener</w:t>
-      </w:r>
-      <w:r>
-        <w:t xml:space="preserve"> </w:t>
-      </w:r>
-      <w:r>
-        <w:t xml:space="preserve">— New moment: the module's opening film (about 75 s; draft media for the media preview). The narration is approved text, verbatim (m7-p01 body, sentences 1, 2; m7-p02 audioScript, sentences 1, 2, 3, 4, 5, 6, 8, 9, 10); the presenter is a HeyGen digital avatar, and the player shows "Presented by a digital avatar (AI-generated presenter and voice)." under the video. The moments' position labels are renumbered to /23.</w:t>
-      </w:r>
-    </w:p>
-    <w:bookmarkStart w:id="22" w:name="Xdc46ab43abd29ccd7bdb0a194d70020c84764fc"/>
-    <w:p>
-      <w:pPr>
-        <w:pStyle w:val="Heading4"/>
-      </w:pPr>
-      <w:r>
-        <w:t xml:space="preserve">Now reads: 02 / 23 · Evidence, regulation and compliance</w:t>
-      </w:r>
-    </w:p>
-    <w:p>
-      <w:pPr>
-        <w:pStyle w:val="FirstParagraph"/>
-      </w:pPr>
-      <w:r>
-        <w:rPr>
-          <w:i/>
-          <w:iCs/>
-        </w:rPr>
-        <w:t xml:space="preserve">Module 07 · Opening film · video</w:t>
-      </w:r>
-    </w:p>
-    <w:p>
-      <w:pPr>
-        <w:pStyle w:val="BodyText"/>
-      </w:pPr>
-      <w:r>
-        <w:t xml:space="preserve">Sources: Balshem H 2011 · Guyatt GH 2008 · Guyatt G 2025 · The Peptide Pocket Guide — 2026 Edition · Clinical Reference (seventy-two entries) 2026 · Aesthetic &amp; Regenerative Endocrinology — A Clinician's Pocket Guide 2026</w:t>
-      </w:r>
-    </w:p>
-    <w:bookmarkEnd w:id="22"/>
-    <w:bookmarkEnd w:id="23"/>
-    <w:bookmarkEnd w:id="24"/>
-    <w:bookmarkEnd w:id="25"/>
     <w:sectPr>
       <w:footnotePr>
         <w:numRestart w:val="eachSect"/>
@@ -590,123 +160,8 @@
       </w:pPr>
     </w:lvl>
   </w:abstractNum>
-  <w:abstractNum w:abstractNumId="99411">
-    <w:nsid w:val="00A99411"/>
-    <w:multiLevelType w:val="multilevel"/>
-    <w:lvl w:ilvl="0">
-      <w:start w:val="1"/>
-      <w:numFmt w:val="decimal"/>
-      <w:lvlText w:val="%1."/>
-      <w:lvlJc w:val="left"/>
-      <w:pPr>
-        <w:ind w:left="720" w:hanging="360"/>
-      </w:pPr>
-    </w:lvl>
-    <w:lvl w:ilvl="1">
-      <w:start w:val="1"/>
-      <w:numFmt w:val="decimal"/>
-      <w:lvlText w:val="%2."/>
-      <w:lvlJc w:val="left"/>
-      <w:pPr>
-        <w:ind w:left="1440" w:hanging="360"/>
-      </w:pPr>
-    </w:lvl>
-    <w:lvl w:ilvl="2">
-      <w:start w:val="1"/>
-      <w:numFmt w:val="decimal"/>
-      <w:lvlText w:val="%3."/>
-      <w:lvlJc w:val="left"/>
-      <w:pPr>
-        <w:ind w:left="2160" w:hanging="360"/>
-      </w:pPr>
-    </w:lvl>
-    <w:lvl w:ilvl="3">
-      <w:start w:val="1"/>
-      <w:numFmt w:val="decimal"/>
-      <w:lvlText w:val="%4."/>
-      <w:lvlJc w:val="left"/>
-      <w:pPr>
-        <w:ind w:left="2880" w:hanging="360"/>
-      </w:pPr>
-    </w:lvl>
-    <w:lvl w:ilvl="4">
-      <w:start w:val="1"/>
-      <w:numFmt w:val="decimal"/>
-      <w:lvlText w:val="%5."/>
-      <w:lvlJc w:val="left"/>
-      <w:pPr>
-        <w:ind w:left="3600" w:hanging="360"/>
-      </w:pPr>
-    </w:lvl>
-    <w:lvl w:ilvl="5">
-      <w:start w:val="1"/>
-      <w:numFmt w:val="decimal"/>
-      <w:lvlText w:val="%6."/>
-      <w:lvlJc w:val="left"/>
-      <w:pPr>
-        <w:ind w:left="4320" w:hanging="360"/>
-      </w:pPr>
-    </w:lvl>
-    <w:lvl w:ilvl="6">
-      <w:start w:val="1"/>
-      <w:numFmt w:val="decimal"/>
-      <w:lvlText w:val="%7."/>
-      <w:lvlJc w:val="left"/>
-      <w:pPr>
-        <w:ind w:left="5040" w:hanging="360"/>
-      </w:pPr>
-    </w:lvl>
-    <w:lvl w:ilvl="7">
-      <w:start w:val="1"/>
-      <w:numFmt w:val="decimal"/>
-      <w:lvlText w:val="%8."/>
-      <w:lvlJc w:val="left"/>
-      <w:pPr>
-        <w:ind w:left="5760" w:hanging="360"/>
-      </w:pPr>
-    </w:lvl>
-    <w:lvl w:ilvl="8">
-      <w:start w:val="1"/>
-      <w:numFmt w:val="decimal"/>
-      <w:lvlText w:val="%9."/>
-      <w:lvlJc w:val="left"/>
-      <w:pPr>
-        <w:ind w:left="6480" w:hanging="360"/>
-      </w:pPr>
-    </w:lvl>
-  </w:abstractNum>
   <w:num w:numId="1000">
     <w:abstractNumId w:val="990"/>
-  </w:num>
-  <w:num w:numId="1001">
-    <w:abstractNumId w:val="99411"/>
-    <w:lvlOverride w:ilvl="0">
-      <w:startOverride w:val="1"/>
-    </w:lvlOverride>
-    <w:lvlOverride w:ilvl="1">
-      <w:startOverride w:val="1"/>
-    </w:lvlOverride>
-    <w:lvlOverride w:ilvl="2">
-      <w:startOverride w:val="1"/>
-    </w:lvlOverride>
-    <w:lvlOverride w:ilvl="3">
-      <w:startOverride w:val="1"/>
-    </w:lvlOverride>
-    <w:lvlOverride w:ilvl="4">
-      <w:startOverride w:val="1"/>
-    </w:lvlOverride>
-    <w:lvlOverride w:ilvl="5">
-      <w:startOverride w:val="1"/>
-    </w:lvlOverride>
-    <w:lvlOverride w:ilvl="6">
-      <w:startOverride w:val="1"/>
-    </w:lvlOverride>
-    <w:lvlOverride w:ilvl="7">
-      <w:startOverride w:val="1"/>
-    </w:lvlOverride>
-    <w:lvlOverride w:ilvl="8">
-      <w:startOverride w:val="1"/>
-    </w:lvlOverride>
   </w:num>
 </w:numbering>
 </file>

</xml_diff>